<commit_message>
docs(avance1): documento de seguimiento con evidencias del avance 1
</commit_message>
<xml_diff>
--- a/farmacia/evidencia/Universidad Mariano Gálvez de Guatemala.docx
+++ b/farmacia/evidencia/Universidad Mariano Gálvez de Guatemala.docx
@@ -133,7 +133,7 @@
                     </pic:cNvPicPr>
                   </pic:nvPicPr>
                   <pic:blipFill>
-                    <a:blip r:embed="rId5" cstate="print">
+                    <a:blip r:embed="rId7" cstate="print">
                       <a:alphaModFix amt="35000"/>
                       <a:extLst>
                         <a:ext uri="{28A0092B-C50C-407E-A947-70E740481C1C}">
@@ -379,7 +379,7 @@
           <w14:ligatures w14:val="none"/>
         </w:rPr>
         <w:sectPr>
-          <w:footerReference w:type="default" r:id="rId6"/>
+          <w:footerReference w:type="default" r:id="rId8"/>
           <w:pgSz w:w="12240" w:h="15840" w:code="1"/>
           <w:pgMar w:top="1440" w:right="1440" w:bottom="1440" w:left="1440" w:header="709" w:footer="709" w:gutter="0"/>
           <w:pgNumType w:start="12"/>
@@ -438,7 +438,7 @@
       </w:r>
     </w:p>
     <w:p>
-      <w:hyperlink r:id="rId7" w:history="1">
+      <w:hyperlink r:id="rId9" w:history="1">
         <w:r>
           <w:rPr>
             <w:rStyle w:val="Hipervnculo"/>
@@ -465,8 +465,13 @@
         <w:pStyle w:val="Ttulo1"/>
       </w:pPr>
       <w:r>
-        <w:t>Configuración utilizada en Spring Initializ</w:t>
+        <w:t xml:space="preserve">Configuración utilizada en Spring </w:t>
       </w:r>
+      <w:proofErr w:type="spellStart"/>
+      <w:r>
+        <w:t>Initializ</w:t>
+      </w:r>
+      <w:proofErr w:type="spellEnd"/>
     </w:p>
     <w:p>
       <w:pPr>
@@ -497,7 +502,7 @@
                     </pic:cNvPicPr>
                   </pic:nvPicPr>
                   <pic:blipFill>
-                    <a:blip r:embed="rId8">
+                    <a:blip r:embed="rId10">
                       <a:extLst>
                         <a:ext uri="{28A0092B-C50C-407E-A947-70E740481C1C}">
                           <a14:useLocalDpi xmlns:a14="http://schemas.microsoft.com/office/drawing/2010/main" val="0"/>
@@ -559,7 +564,7 @@
                     </pic:cNvPicPr>
                   </pic:nvPicPr>
                   <pic:blipFill>
-                    <a:blip r:embed="rId9">
+                    <a:blip r:embed="rId11">
                       <a:extLst>
                         <a:ext uri="{28A0092B-C50C-407E-A947-70E740481C1C}">
                           <a14:useLocalDpi xmlns:a14="http://schemas.microsoft.com/office/drawing/2010/main" val="0"/>
@@ -618,7 +623,7 @@
                     <pic:cNvPicPr/>
                   </pic:nvPicPr>
                   <pic:blipFill>
-                    <a:blip r:embed="rId10"/>
+                    <a:blip r:embed="rId12"/>
                     <a:stretch>
                       <a:fillRect/>
                     </a:stretch>
@@ -666,7 +671,7 @@
                     <pic:cNvPicPr/>
                   </pic:nvPicPr>
                   <pic:blipFill>
-                    <a:blip r:embed="rId11"/>
+                    <a:blip r:embed="rId13"/>
                     <a:stretch>
                       <a:fillRect/>
                     </a:stretch>
@@ -712,7 +717,7 @@
                     <pic:cNvPicPr/>
                   </pic:nvPicPr>
                   <pic:blipFill>
-                    <a:blip r:embed="rId12"/>
+                    <a:blip r:embed="rId14"/>
                     <a:stretch>
                       <a:fillRect/>
                     </a:stretch>
@@ -766,7 +771,7 @@
                     <pic:cNvPicPr/>
                   </pic:nvPicPr>
                   <pic:blipFill>
-                    <a:blip r:embed="rId13"/>
+                    <a:blip r:embed="rId15"/>
                     <a:stretch>
                       <a:fillRect/>
                     </a:stretch>
@@ -820,7 +825,7 @@
                     </pic:cNvPicPr>
                   </pic:nvPicPr>
                   <pic:blipFill>
-                    <a:blip r:embed="rId14">
+                    <a:blip r:embed="rId16">
                       <a:extLst>
                         <a:ext uri="{28A0092B-C50C-407E-A947-70E740481C1C}">
                           <a14:useLocalDpi xmlns:a14="http://schemas.microsoft.com/office/drawing/2010/main" val="0"/>
@@ -885,7 +890,7 @@
                     </pic:cNvPicPr>
                   </pic:nvPicPr>
                   <pic:blipFill>
-                    <a:blip r:embed="rId15">
+                    <a:blip r:embed="rId17">
                       <a:extLst>
                         <a:ext uri="{28A0092B-C50C-407E-A947-70E740481C1C}">
                           <a14:useLocalDpi xmlns:a14="http://schemas.microsoft.com/office/drawing/2010/main" val="0"/>
@@ -916,6 +921,720 @@
           </wp:inline>
         </w:drawing>
       </w:r>
+      <w:r>
+        <w:rPr>
+          <w:noProof/>
+        </w:rPr>
+        <w:drawing>
+          <wp:inline distT="0" distB="0" distL="0" distR="0" wp14:anchorId="105E93F7" wp14:editId="175F2301">
+            <wp:extent cx="5592445" cy="3009265"/>
+            <wp:effectExtent l="0" t="0" r="8255" b="635"/>
+            <wp:docPr id="12" name="Imagen 12"/>
+            <wp:cNvGraphicFramePr>
+              <a:graphicFrameLocks xmlns:a="http://schemas.openxmlformats.org/drawingml/2006/main" noChangeAspect="1"/>
+            </wp:cNvGraphicFramePr>
+            <a:graphic xmlns:a="http://schemas.openxmlformats.org/drawingml/2006/main">
+              <a:graphicData uri="http://schemas.openxmlformats.org/drawingml/2006/picture">
+                <pic:pic xmlns:pic="http://schemas.openxmlformats.org/drawingml/2006/picture">
+                  <pic:nvPicPr>
+                    <pic:cNvPr id="0" name="Picture 7"/>
+                    <pic:cNvPicPr>
+                      <a:picLocks noChangeAspect="1" noChangeArrowheads="1"/>
+                    </pic:cNvPicPr>
+                  </pic:nvPicPr>
+                  <pic:blipFill>
+                    <a:blip r:embed="rId18" cstate="print">
+                      <a:extLst>
+                        <a:ext uri="{28A0092B-C50C-407E-A947-70E740481C1C}">
+                          <a14:useLocalDpi xmlns:a14="http://schemas.microsoft.com/office/drawing/2010/main" val="0"/>
+                        </a:ext>
+                      </a:extLst>
+                    </a:blip>
+                    <a:srcRect/>
+                    <a:stretch>
+                      <a:fillRect/>
+                    </a:stretch>
+                  </pic:blipFill>
+                  <pic:spPr bwMode="auto">
+                    <a:xfrm>
+                      <a:off x="0" y="0"/>
+                      <a:ext cx="5592445" cy="3009265"/>
+                    </a:xfrm>
+                    <a:prstGeom prst="rect">
+                      <a:avLst/>
+                    </a:prstGeom>
+                    <a:noFill/>
+                    <a:ln>
+                      <a:noFill/>
+                    </a:ln>
+                  </pic:spPr>
+                </pic:pic>
+              </a:graphicData>
+            </a:graphic>
+          </wp:inline>
+        </w:drawing>
+      </w:r>
+    </w:p>
+    <w:p>
+      <w:r>
+        <w:rPr>
+          <w:noProof/>
+        </w:rPr>
+        <w:lastRenderedPageBreak/>
+        <w:drawing>
+          <wp:inline distT="0" distB="0" distL="0" distR="0" wp14:anchorId="7B792294" wp14:editId="5A7886AB">
+            <wp:extent cx="5603240" cy="3041015"/>
+            <wp:effectExtent l="0" t="0" r="0" b="6985"/>
+            <wp:docPr id="13" name="Imagen 13"/>
+            <wp:cNvGraphicFramePr>
+              <a:graphicFrameLocks xmlns:a="http://schemas.openxmlformats.org/drawingml/2006/main" noChangeAspect="1"/>
+            </wp:cNvGraphicFramePr>
+            <a:graphic xmlns:a="http://schemas.openxmlformats.org/drawingml/2006/main">
+              <a:graphicData uri="http://schemas.openxmlformats.org/drawingml/2006/picture">
+                <pic:pic xmlns:pic="http://schemas.openxmlformats.org/drawingml/2006/picture">
+                  <pic:nvPicPr>
+                    <pic:cNvPr id="0" name="Picture 8"/>
+                    <pic:cNvPicPr>
+                      <a:picLocks noChangeAspect="1" noChangeArrowheads="1"/>
+                    </pic:cNvPicPr>
+                  </pic:nvPicPr>
+                  <pic:blipFill>
+                    <a:blip r:embed="rId19">
+                      <a:extLst>
+                        <a:ext uri="{28A0092B-C50C-407E-A947-70E740481C1C}">
+                          <a14:useLocalDpi xmlns:a14="http://schemas.microsoft.com/office/drawing/2010/main" val="0"/>
+                        </a:ext>
+                      </a:extLst>
+                    </a:blip>
+                    <a:srcRect/>
+                    <a:stretch>
+                      <a:fillRect/>
+                    </a:stretch>
+                  </pic:blipFill>
+                  <pic:spPr bwMode="auto">
+                    <a:xfrm>
+                      <a:off x="0" y="0"/>
+                      <a:ext cx="5603240" cy="3041015"/>
+                    </a:xfrm>
+                    <a:prstGeom prst="rect">
+                      <a:avLst/>
+                    </a:prstGeom>
+                    <a:noFill/>
+                    <a:ln>
+                      <a:noFill/>
+                    </a:ln>
+                  </pic:spPr>
+                </pic:pic>
+              </a:graphicData>
+            </a:graphic>
+          </wp:inline>
+        </w:drawing>
+      </w:r>
+      <w:r>
+        <w:rPr>
+          <w:noProof/>
+        </w:rPr>
+        <w:drawing>
+          <wp:inline distT="0" distB="0" distL="0" distR="0" wp14:anchorId="0A2E7789" wp14:editId="33AC6EC1">
+            <wp:extent cx="5603240" cy="1052830"/>
+            <wp:effectExtent l="0" t="0" r="0" b="0"/>
+            <wp:docPr id="14" name="Imagen 14"/>
+            <wp:cNvGraphicFramePr>
+              <a:graphicFrameLocks xmlns:a="http://schemas.openxmlformats.org/drawingml/2006/main" noChangeAspect="1"/>
+            </wp:cNvGraphicFramePr>
+            <a:graphic xmlns:a="http://schemas.openxmlformats.org/drawingml/2006/main">
+              <a:graphicData uri="http://schemas.openxmlformats.org/drawingml/2006/picture">
+                <pic:pic xmlns:pic="http://schemas.openxmlformats.org/drawingml/2006/picture">
+                  <pic:nvPicPr>
+                    <pic:cNvPr id="0" name="Picture 9"/>
+                    <pic:cNvPicPr>
+                      <a:picLocks noChangeAspect="1" noChangeArrowheads="1"/>
+                    </pic:cNvPicPr>
+                  </pic:nvPicPr>
+                  <pic:blipFill>
+                    <a:blip r:embed="rId20">
+                      <a:extLst>
+                        <a:ext uri="{28A0092B-C50C-407E-A947-70E740481C1C}">
+                          <a14:useLocalDpi xmlns:a14="http://schemas.microsoft.com/office/drawing/2010/main" val="0"/>
+                        </a:ext>
+                      </a:extLst>
+                    </a:blip>
+                    <a:srcRect/>
+                    <a:stretch>
+                      <a:fillRect/>
+                    </a:stretch>
+                  </pic:blipFill>
+                  <pic:spPr bwMode="auto">
+                    <a:xfrm>
+                      <a:off x="0" y="0"/>
+                      <a:ext cx="5603240" cy="1052830"/>
+                    </a:xfrm>
+                    <a:prstGeom prst="rect">
+                      <a:avLst/>
+                    </a:prstGeom>
+                    <a:noFill/>
+                    <a:ln>
+                      <a:noFill/>
+                    </a:ln>
+                  </pic:spPr>
+                </pic:pic>
+              </a:graphicData>
+            </a:graphic>
+          </wp:inline>
+        </w:drawing>
+      </w:r>
+      <w:r>
+        <w:rPr>
+          <w:noProof/>
+        </w:rPr>
+        <w:lastRenderedPageBreak/>
+        <w:drawing>
+          <wp:inline distT="0" distB="0" distL="0" distR="0" wp14:anchorId="6C42F01A" wp14:editId="02A7575C">
+            <wp:extent cx="5614035" cy="5996940"/>
+            <wp:effectExtent l="0" t="0" r="5715" b="3810"/>
+            <wp:docPr id="15" name="Imagen 15"/>
+            <wp:cNvGraphicFramePr>
+              <a:graphicFrameLocks xmlns:a="http://schemas.openxmlformats.org/drawingml/2006/main" noChangeAspect="1"/>
+            </wp:cNvGraphicFramePr>
+            <a:graphic xmlns:a="http://schemas.openxmlformats.org/drawingml/2006/main">
+              <a:graphicData uri="http://schemas.openxmlformats.org/drawingml/2006/picture">
+                <pic:pic xmlns:pic="http://schemas.openxmlformats.org/drawingml/2006/picture">
+                  <pic:nvPicPr>
+                    <pic:cNvPr id="0" name="Picture 10"/>
+                    <pic:cNvPicPr>
+                      <a:picLocks noChangeAspect="1" noChangeArrowheads="1"/>
+                    </pic:cNvPicPr>
+                  </pic:nvPicPr>
+                  <pic:blipFill>
+                    <a:blip r:embed="rId21">
+                      <a:extLst>
+                        <a:ext uri="{28A0092B-C50C-407E-A947-70E740481C1C}">
+                          <a14:useLocalDpi xmlns:a14="http://schemas.microsoft.com/office/drawing/2010/main" val="0"/>
+                        </a:ext>
+                      </a:extLst>
+                    </a:blip>
+                    <a:srcRect/>
+                    <a:stretch>
+                      <a:fillRect/>
+                    </a:stretch>
+                  </pic:blipFill>
+                  <pic:spPr bwMode="auto">
+                    <a:xfrm>
+                      <a:off x="0" y="0"/>
+                      <a:ext cx="5614035" cy="5996940"/>
+                    </a:xfrm>
+                    <a:prstGeom prst="rect">
+                      <a:avLst/>
+                    </a:prstGeom>
+                    <a:noFill/>
+                    <a:ln>
+                      <a:noFill/>
+                    </a:ln>
+                  </pic:spPr>
+                </pic:pic>
+              </a:graphicData>
+            </a:graphic>
+          </wp:inline>
+        </w:drawing>
+      </w:r>
+    </w:p>
+    <w:p>
+      <w:pPr>
+        <w:pStyle w:val="Ttulo1"/>
+      </w:pPr>
+      <w:r>
+        <w:t>Funciones terminadas del avance 1</w:t>
+      </w:r>
+    </w:p>
+    <w:p>
+      <w:pPr>
+        <w:rPr>
+          <w:lang w:val="es-MX"/>
+        </w:rPr>
+      </w:pPr>
+      <w:r>
+        <w:rPr>
+          <w:lang w:val="es-MX"/>
+        </w:rPr>
+        <w:t xml:space="preserve">Proyecto Maven con Spring </w:t>
+      </w:r>
+      <w:proofErr w:type="spellStart"/>
+      <w:r>
+        <w:rPr>
+          <w:lang w:val="es-MX"/>
+        </w:rPr>
+        <w:t>Boot</w:t>
+      </w:r>
+      <w:proofErr w:type="spellEnd"/>
+      <w:r>
+        <w:rPr>
+          <w:lang w:val="es-MX"/>
+        </w:rPr>
+        <w:t xml:space="preserve"> configurado y ejecutable.</w:t>
+      </w:r>
+    </w:p>
+    <w:p>
+      <w:pPr>
+        <w:rPr>
+          <w:lang w:val="es-MX"/>
+        </w:rPr>
+      </w:pPr>
+      <w:r>
+        <w:rPr>
+          <w:lang w:val="es-MX"/>
+        </w:rPr>
+        <w:t xml:space="preserve">Conexión exitosa a PostgreSQL (base de datos </w:t>
+      </w:r>
+      <w:proofErr w:type="spellStart"/>
+      <w:r>
+        <w:rPr>
+          <w:lang w:val="es-MX"/>
+        </w:rPr>
+        <w:t>farmacia_db</w:t>
+      </w:r>
+      <w:proofErr w:type="spellEnd"/>
+      <w:r>
+        <w:rPr>
+          <w:lang w:val="es-MX"/>
+        </w:rPr>
+        <w:t>).</w:t>
+      </w:r>
+    </w:p>
+    <w:p>
+      <w:pPr>
+        <w:rPr>
+          <w:lang w:val="es-MX"/>
+        </w:rPr>
+      </w:pPr>
+      <w:r>
+        <w:rPr>
+          <w:lang w:val="es-MX"/>
+        </w:rPr>
+        <w:t>Entidad Medicamento creada con JPA.</w:t>
+      </w:r>
+    </w:p>
+    <w:p>
+      <w:pPr>
+        <w:rPr>
+          <w:lang w:val="es-MX"/>
+        </w:rPr>
+      </w:pPr>
+      <w:r>
+        <w:rPr>
+          <w:lang w:val="es-MX"/>
+        </w:rPr>
+        <w:t xml:space="preserve">Tabla medicamento generada automáticamente por </w:t>
+      </w:r>
+      <w:proofErr w:type="spellStart"/>
+      <w:r>
+        <w:rPr>
+          <w:lang w:val="es-MX"/>
+        </w:rPr>
+        <w:t>Hibernate</w:t>
+      </w:r>
+      <w:proofErr w:type="spellEnd"/>
+      <w:r>
+        <w:rPr>
+          <w:lang w:val="es-MX"/>
+        </w:rPr>
+        <w:t>.</w:t>
+      </w:r>
+    </w:p>
+    <w:p>
+      <w:pPr>
+        <w:rPr>
+          <w:lang w:val="es-MX"/>
+        </w:rPr>
+      </w:pPr>
+      <w:r>
+        <w:rPr>
+          <w:lang w:val="es-MX"/>
+        </w:rPr>
+        <w:t>3 medicamentos de prueba insertados en la base de datos.</w:t>
+      </w:r>
+    </w:p>
+    <w:p>
+      <w:pPr>
+        <w:rPr>
+          <w:lang w:val="es-MX"/>
+        </w:rPr>
+      </w:pPr>
+      <w:proofErr w:type="spellStart"/>
+      <w:r>
+        <w:rPr>
+          <w:lang w:val="es-MX"/>
+        </w:rPr>
+        <w:lastRenderedPageBreak/>
+        <w:t>Endpoint</w:t>
+      </w:r>
+      <w:proofErr w:type="spellEnd"/>
+      <w:r>
+        <w:rPr>
+          <w:lang w:val="es-MX"/>
+        </w:rPr>
+        <w:t xml:space="preserve"> GET /api/medicamentos funcionando y devolviendo datos.</w:t>
+      </w:r>
+    </w:p>
+    <w:p>
+      <w:pPr>
+        <w:rPr>
+          <w:lang w:val="es-MX"/>
+        </w:rPr>
+      </w:pPr>
+    </w:p>
+    <w:p>
+      <w:pPr>
+        <w:pStyle w:val="Ttulo1"/>
+      </w:pPr>
+      <w:r>
+        <w:t>Funciones Terminadas</w:t>
+      </w:r>
+    </w:p>
+    <w:p>
+      <w:r>
+        <w:rPr>
+          <w:noProof/>
+        </w:rPr>
+        <w:drawing>
+          <wp:inline distT="0" distB="0" distL="0" distR="0" wp14:anchorId="562A771F" wp14:editId="35710BB3">
+            <wp:extent cx="5603240" cy="3370580"/>
+            <wp:effectExtent l="0" t="0" r="0" b="1270"/>
+            <wp:docPr id="16" name="Imagen 16"/>
+            <wp:cNvGraphicFramePr>
+              <a:graphicFrameLocks xmlns:a="http://schemas.openxmlformats.org/drawingml/2006/main" noChangeAspect="1"/>
+            </wp:cNvGraphicFramePr>
+            <a:graphic xmlns:a="http://schemas.openxmlformats.org/drawingml/2006/main">
+              <a:graphicData uri="http://schemas.openxmlformats.org/drawingml/2006/picture">
+                <pic:pic xmlns:pic="http://schemas.openxmlformats.org/drawingml/2006/picture">
+                  <pic:nvPicPr>
+                    <pic:cNvPr id="0" name="Picture 11"/>
+                    <pic:cNvPicPr>
+                      <a:picLocks noChangeAspect="1" noChangeArrowheads="1"/>
+                    </pic:cNvPicPr>
+                  </pic:nvPicPr>
+                  <pic:blipFill>
+                    <a:blip r:embed="rId22">
+                      <a:extLst>
+                        <a:ext uri="{28A0092B-C50C-407E-A947-70E740481C1C}">
+                          <a14:useLocalDpi xmlns:a14="http://schemas.microsoft.com/office/drawing/2010/main" val="0"/>
+                        </a:ext>
+                      </a:extLst>
+                    </a:blip>
+                    <a:srcRect/>
+                    <a:stretch>
+                      <a:fillRect/>
+                    </a:stretch>
+                  </pic:blipFill>
+                  <pic:spPr bwMode="auto">
+                    <a:xfrm>
+                      <a:off x="0" y="0"/>
+                      <a:ext cx="5603240" cy="3370580"/>
+                    </a:xfrm>
+                    <a:prstGeom prst="rect">
+                      <a:avLst/>
+                    </a:prstGeom>
+                    <a:noFill/>
+                    <a:ln>
+                      <a:noFill/>
+                    </a:ln>
+                  </pic:spPr>
+                </pic:pic>
+              </a:graphicData>
+            </a:graphic>
+          </wp:inline>
+        </w:drawing>
+      </w:r>
+      <w:r>
+        <w:rPr>
+          <w:noProof/>
+        </w:rPr>
+        <w:drawing>
+          <wp:inline distT="0" distB="0" distL="0" distR="0" wp14:anchorId="61CFF9B7" wp14:editId="636D7601">
+            <wp:extent cx="5592445" cy="1786255"/>
+            <wp:effectExtent l="0" t="0" r="8255" b="4445"/>
+            <wp:docPr id="17" name="Imagen 17"/>
+            <wp:cNvGraphicFramePr>
+              <a:graphicFrameLocks xmlns:a="http://schemas.openxmlformats.org/drawingml/2006/main" noChangeAspect="1"/>
+            </wp:cNvGraphicFramePr>
+            <a:graphic xmlns:a="http://schemas.openxmlformats.org/drawingml/2006/main">
+              <a:graphicData uri="http://schemas.openxmlformats.org/drawingml/2006/picture">
+                <pic:pic xmlns:pic="http://schemas.openxmlformats.org/drawingml/2006/picture">
+                  <pic:nvPicPr>
+                    <pic:cNvPr id="0" name="Picture 12"/>
+                    <pic:cNvPicPr>
+                      <a:picLocks noChangeAspect="1" noChangeArrowheads="1"/>
+                    </pic:cNvPicPr>
+                  </pic:nvPicPr>
+                  <pic:blipFill>
+                    <a:blip r:embed="rId23" cstate="print">
+                      <a:extLst>
+                        <a:ext uri="{28A0092B-C50C-407E-A947-70E740481C1C}">
+                          <a14:useLocalDpi xmlns:a14="http://schemas.microsoft.com/office/drawing/2010/main" val="0"/>
+                        </a:ext>
+                      </a:extLst>
+                    </a:blip>
+                    <a:srcRect/>
+                    <a:stretch>
+                      <a:fillRect/>
+                    </a:stretch>
+                  </pic:blipFill>
+                  <pic:spPr bwMode="auto">
+                    <a:xfrm>
+                      <a:off x="0" y="0"/>
+                      <a:ext cx="5592445" cy="1786255"/>
+                    </a:xfrm>
+                    <a:prstGeom prst="rect">
+                      <a:avLst/>
+                    </a:prstGeom>
+                    <a:noFill/>
+                    <a:ln>
+                      <a:noFill/>
+                    </a:ln>
+                  </pic:spPr>
+                </pic:pic>
+              </a:graphicData>
+            </a:graphic>
+          </wp:inline>
+        </w:drawing>
+      </w:r>
+      <w:r>
+        <w:rPr>
+          <w:noProof/>
+        </w:rPr>
+        <w:drawing>
+          <wp:inline distT="0" distB="0" distL="0" distR="0" wp14:anchorId="4A9ECD13" wp14:editId="2AD37F1A">
+            <wp:extent cx="5614035" cy="1392555"/>
+            <wp:effectExtent l="0" t="0" r="5715" b="0"/>
+            <wp:docPr id="18" name="Imagen 18"/>
+            <wp:cNvGraphicFramePr>
+              <a:graphicFrameLocks xmlns:a="http://schemas.openxmlformats.org/drawingml/2006/main" noChangeAspect="1"/>
+            </wp:cNvGraphicFramePr>
+            <a:graphic xmlns:a="http://schemas.openxmlformats.org/drawingml/2006/main">
+              <a:graphicData uri="http://schemas.openxmlformats.org/drawingml/2006/picture">
+                <pic:pic xmlns:pic="http://schemas.openxmlformats.org/drawingml/2006/picture">
+                  <pic:nvPicPr>
+                    <pic:cNvPr id="0" name="Picture 13"/>
+                    <pic:cNvPicPr>
+                      <a:picLocks noChangeAspect="1" noChangeArrowheads="1"/>
+                    </pic:cNvPicPr>
+                  </pic:nvPicPr>
+                  <pic:blipFill>
+                    <a:blip r:embed="rId24">
+                      <a:extLst>
+                        <a:ext uri="{28A0092B-C50C-407E-A947-70E740481C1C}">
+                          <a14:useLocalDpi xmlns:a14="http://schemas.microsoft.com/office/drawing/2010/main" val="0"/>
+                        </a:ext>
+                      </a:extLst>
+                    </a:blip>
+                    <a:srcRect/>
+                    <a:stretch>
+                      <a:fillRect/>
+                    </a:stretch>
+                  </pic:blipFill>
+                  <pic:spPr bwMode="auto">
+                    <a:xfrm>
+                      <a:off x="0" y="0"/>
+                      <a:ext cx="5614035" cy="1392555"/>
+                    </a:xfrm>
+                    <a:prstGeom prst="rect">
+                      <a:avLst/>
+                    </a:prstGeom>
+                    <a:noFill/>
+                    <a:ln>
+                      <a:noFill/>
+                    </a:ln>
+                  </pic:spPr>
+                </pic:pic>
+              </a:graphicData>
+            </a:graphic>
+          </wp:inline>
+        </w:drawing>
+      </w:r>
+    </w:p>
+    <w:p/>
+    <w:p>
+      <w:pPr>
+        <w:rPr>
+          <w:lang w:val="es-MX"/>
+        </w:rPr>
+      </w:pPr>
+      <w:r>
+        <w:rPr>
+          <w:lang w:val="es-MX"/>
+        </w:rPr>
+        <w:lastRenderedPageBreak/>
+        <w:t xml:space="preserve">Durante este primer avance logré configurar correctamente el entorno de desarrollo y establecer la conexión entre Spring </w:t>
+      </w:r>
+      <w:proofErr w:type="spellStart"/>
+      <w:r>
+        <w:rPr>
+          <w:lang w:val="es-MX"/>
+        </w:rPr>
+        <w:t>Boot</w:t>
+      </w:r>
+      <w:proofErr w:type="spellEnd"/>
+      <w:r>
+        <w:rPr>
+          <w:lang w:val="es-MX"/>
+        </w:rPr>
+        <w:t xml:space="preserve"> y la base de datos. La mayor dificultad fue la configuración del JDK y Maven, pero se resolvió ajustando las versiones. El siguiente paso es implementar el CRUD completo con </w:t>
+      </w:r>
+      <w:proofErr w:type="spellStart"/>
+      <w:r>
+        <w:rPr>
+          <w:lang w:val="es-MX"/>
+        </w:rPr>
+        <w:t>DTOs</w:t>
+      </w:r>
+      <w:proofErr w:type="spellEnd"/>
+      <w:r>
+        <w:rPr>
+          <w:lang w:val="es-MX"/>
+        </w:rPr>
+        <w:t xml:space="preserve"> y validaciones.</w:t>
+      </w:r>
+    </w:p>
+    <w:p>
+      <w:pPr>
+        <w:rPr>
+          <w:lang w:val="es-MX"/>
+        </w:rPr>
+      </w:pPr>
+    </w:p>
+    <w:p>
+      <w:pPr>
+        <w:rPr>
+          <w:lang w:val="es-MX"/>
+        </w:rPr>
+      </w:pPr>
+      <w:r>
+        <w:rPr>
+          <w:lang w:val="es-MX"/>
+        </w:rPr>
+        <w:t>Erros que ocurrieron durante el primer avance.</w:t>
+      </w:r>
+    </w:p>
+    <w:p>
+      <w:pPr>
+        <w:rPr>
+          <w:lang w:val="es-MX"/>
+        </w:rPr>
+      </w:pPr>
+      <w:r>
+        <w:rPr>
+          <w:noProof/>
+          <w:lang w:val="es-MX"/>
+        </w:rPr>
+        <w:drawing>
+          <wp:inline distT="0" distB="0" distL="0" distR="0" wp14:anchorId="3F37427F" wp14:editId="6B824B66">
+            <wp:extent cx="5603240" cy="2200910"/>
+            <wp:effectExtent l="0" t="0" r="0" b="8890"/>
+            <wp:docPr id="19" name="Imagen 19"/>
+            <wp:cNvGraphicFramePr>
+              <a:graphicFrameLocks xmlns:a="http://schemas.openxmlformats.org/drawingml/2006/main" noChangeAspect="1"/>
+            </wp:cNvGraphicFramePr>
+            <a:graphic xmlns:a="http://schemas.openxmlformats.org/drawingml/2006/main">
+              <a:graphicData uri="http://schemas.openxmlformats.org/drawingml/2006/picture">
+                <pic:pic xmlns:pic="http://schemas.openxmlformats.org/drawingml/2006/picture">
+                  <pic:nvPicPr>
+                    <pic:cNvPr id="0" name="Picture 14"/>
+                    <pic:cNvPicPr>
+                      <a:picLocks noChangeAspect="1" noChangeArrowheads="1"/>
+                    </pic:cNvPicPr>
+                  </pic:nvPicPr>
+                  <pic:blipFill>
+                    <a:blip r:embed="rId25">
+                      <a:extLst>
+                        <a:ext uri="{28A0092B-C50C-407E-A947-70E740481C1C}">
+                          <a14:useLocalDpi xmlns:a14="http://schemas.microsoft.com/office/drawing/2010/main" val="0"/>
+                        </a:ext>
+                      </a:extLst>
+                    </a:blip>
+                    <a:srcRect/>
+                    <a:stretch>
+                      <a:fillRect/>
+                    </a:stretch>
+                  </pic:blipFill>
+                  <pic:spPr bwMode="auto">
+                    <a:xfrm>
+                      <a:off x="0" y="0"/>
+                      <a:ext cx="5603240" cy="2200910"/>
+                    </a:xfrm>
+                    <a:prstGeom prst="rect">
+                      <a:avLst/>
+                    </a:prstGeom>
+                    <a:noFill/>
+                    <a:ln>
+                      <a:noFill/>
+                    </a:ln>
+                  </pic:spPr>
+                </pic:pic>
+              </a:graphicData>
+            </a:graphic>
+          </wp:inline>
+        </w:drawing>
+      </w:r>
+      <w:r>
+        <w:rPr>
+          <w:noProof/>
+          <w:lang w:val="es-MX"/>
+        </w:rPr>
+        <w:drawing>
+          <wp:inline distT="0" distB="0" distL="0" distR="0" wp14:anchorId="21165D32" wp14:editId="0D7ADD3D">
+            <wp:extent cx="5592445" cy="201930"/>
+            <wp:effectExtent l="0" t="0" r="8255" b="7620"/>
+            <wp:docPr id="20" name="Imagen 20"/>
+            <wp:cNvGraphicFramePr>
+              <a:graphicFrameLocks xmlns:a="http://schemas.openxmlformats.org/drawingml/2006/main" noChangeAspect="1"/>
+            </wp:cNvGraphicFramePr>
+            <a:graphic xmlns:a="http://schemas.openxmlformats.org/drawingml/2006/main">
+              <a:graphicData uri="http://schemas.openxmlformats.org/drawingml/2006/picture">
+                <pic:pic xmlns:pic="http://schemas.openxmlformats.org/drawingml/2006/picture">
+                  <pic:nvPicPr>
+                    <pic:cNvPr id="0" name="Picture 15"/>
+                    <pic:cNvPicPr>
+                      <a:picLocks noChangeAspect="1" noChangeArrowheads="1"/>
+                    </pic:cNvPicPr>
+                  </pic:nvPicPr>
+                  <pic:blipFill>
+                    <a:blip r:embed="rId26" cstate="print">
+                      <a:extLst>
+                        <a:ext uri="{28A0092B-C50C-407E-A947-70E740481C1C}">
+                          <a14:useLocalDpi xmlns:a14="http://schemas.microsoft.com/office/drawing/2010/main" val="0"/>
+                        </a:ext>
+                      </a:extLst>
+                    </a:blip>
+                    <a:srcRect/>
+                    <a:stretch>
+                      <a:fillRect/>
+                    </a:stretch>
+                  </pic:blipFill>
+                  <pic:spPr bwMode="auto">
+                    <a:xfrm>
+                      <a:off x="0" y="0"/>
+                      <a:ext cx="5592445" cy="201930"/>
+                    </a:xfrm>
+                    <a:prstGeom prst="rect">
+                      <a:avLst/>
+                    </a:prstGeom>
+                    <a:noFill/>
+                    <a:ln>
+                      <a:noFill/>
+                    </a:ln>
+                  </pic:spPr>
+                </pic:pic>
+              </a:graphicData>
+            </a:graphic>
+          </wp:inline>
+        </w:drawing>
+      </w:r>
+    </w:p>
+    <w:p>
+      <w:pPr>
+        <w:rPr>
+          <w:lang w:val="es-MX"/>
+        </w:rPr>
+      </w:pPr>
     </w:p>
     <w:sectPr>
       <w:pgSz w:w="12240" w:h="15840"/>
@@ -925,6 +1644,31 @@
     </w:sectPr>
   </w:body>
 </w:document>
+</file>
+
+<file path=word/endnotes.xml><?xml version="1.0" encoding="utf-8"?>
+<w:endnotes xmlns:wpc="http://schemas.microsoft.com/office/word/2010/wordprocessingCanvas" xmlns:cx="http://schemas.microsoft.com/office/drawing/2014/chartex" xmlns:cx1="http://schemas.microsoft.com/office/drawing/2015/9/8/chartex" xmlns:cx2="http://schemas.microsoft.com/office/drawing/2015/10/21/chartex" xmlns:cx3="http://schemas.microsoft.com/office/drawing/2016/5/9/chartex" xmlns:cx4="http://schemas.microsoft.com/office/drawing/2016/5/10/chartex" xmlns:cx5="http://schemas.microsoft.com/office/drawing/2016/5/11/chartex" xmlns:cx6="http://schemas.microsoft.com/office/drawing/2016/5/12/chartex" xmlns:cx7="http://schemas.microsoft.com/office/drawing/2016/5/13/chartex" xmlns:cx8="http://schemas.microsoft.com/office/drawing/2016/5/14/chartex" xmlns:mc="http://schemas.openxmlformats.org/markup-compatibility/2006" xmlns:aink="http://schemas.microsoft.com/office/drawing/2016/ink" xmlns:am3d="http://schemas.microsoft.com/office/drawing/2017/model3d" xmlns:o="urn:schemas-microsoft-com:office:office" xmlns:r="http://schemas.openxmlformats.org/officeDocument/2006/relationships" xmlns:m="http://schemas.openxmlformats.org/officeDocument/2006/math" xmlns:v="urn:schemas-microsoft-com:vml" xmlns:wp14="http://schemas.microsoft.com/office/word/2010/wordprocessingDrawing" xmlns:wp="http://schemas.openxmlformats.org/drawingml/2006/wordprocessingDrawing" xmlns:w10="urn:schemas-microsoft-com:office:word" xmlns:w="http://schemas.openxmlformats.org/wordprocessingml/2006/main" xmlns:w14="http://schemas.microsoft.com/office/word/2010/wordml" xmlns:w15="http://schemas.microsoft.com/office/word/2012/wordml" xmlns:w16cex="http://schemas.microsoft.com/office/word/2018/wordml/cex" xmlns:w16cid="http://schemas.microsoft.com/office/word/2016/wordml/cid" xmlns:w16="http://schemas.microsoft.com/office/word/2018/wordml" xmlns:w16sdtdh="http://schemas.microsoft.com/office/word/2020/wordml/sdtdatahash" xmlns:w16se="http://schemas.microsoft.com/office/word/2015/wordml/symex" xmlns:wpg="http://schemas.microsoft.com/office/word/2010/wordprocessingGroup" xmlns:wpi="http://schemas.microsoft.com/office/word/2010/wordprocessingInk" xmlns:wne="http://schemas.microsoft.com/office/word/2006/wordml" xmlns:wps="http://schemas.microsoft.com/office/word/2010/wordprocessingShape" mc:Ignorable="w14 w15 w16se w16cid w16 w16cex w16sdtdh wp14">
+  <w:endnote w:type="separator" w:id="-1">
+    <w:p>
+      <w:pPr>
+        <w:spacing w:after="0" w:line="240" w:lineRule="auto"/>
+      </w:pPr>
+      <w:r>
+        <w:separator/>
+      </w:r>
+    </w:p>
+  </w:endnote>
+  <w:endnote w:type="continuationSeparator" w:id="0">
+    <w:p>
+      <w:pPr>
+        <w:spacing w:after="0" w:line="240" w:lineRule="auto"/>
+      </w:pPr>
+      <w:r>
+        <w:continuationSeparator/>
+      </w:r>
+    </w:p>
+  </w:endnote>
+</w:endnotes>
 </file>
 
 <file path=word/footer1.xml><?xml version="1.0" encoding="utf-8"?>
@@ -940,6 +1684,31 @@
     </w:pPr>
   </w:p>
 </w:ftr>
+</file>
+
+<file path=word/footnotes.xml><?xml version="1.0" encoding="utf-8"?>
+<w:footnotes xmlns:wpc="http://schemas.microsoft.com/office/word/2010/wordprocessingCanvas" xmlns:cx="http://schemas.microsoft.com/office/drawing/2014/chartex" xmlns:cx1="http://schemas.microsoft.com/office/drawing/2015/9/8/chartex" xmlns:cx2="http://schemas.microsoft.com/office/drawing/2015/10/21/chartex" xmlns:cx3="http://schemas.microsoft.com/office/drawing/2016/5/9/chartex" xmlns:cx4="http://schemas.microsoft.com/office/drawing/2016/5/10/chartex" xmlns:cx5="http://schemas.microsoft.com/office/drawing/2016/5/11/chartex" xmlns:cx6="http://schemas.microsoft.com/office/drawing/2016/5/12/chartex" xmlns:cx7="http://schemas.microsoft.com/office/drawing/2016/5/13/chartex" xmlns:cx8="http://schemas.microsoft.com/office/drawing/2016/5/14/chartex" xmlns:mc="http://schemas.openxmlformats.org/markup-compatibility/2006" xmlns:aink="http://schemas.microsoft.com/office/drawing/2016/ink" xmlns:am3d="http://schemas.microsoft.com/office/drawing/2017/model3d" xmlns:o="urn:schemas-microsoft-com:office:office" xmlns:r="http://schemas.openxmlformats.org/officeDocument/2006/relationships" xmlns:m="http://schemas.openxmlformats.org/officeDocument/2006/math" xmlns:v="urn:schemas-microsoft-com:vml" xmlns:wp14="http://schemas.microsoft.com/office/word/2010/wordprocessingDrawing" xmlns:wp="http://schemas.openxmlformats.org/drawingml/2006/wordprocessingDrawing" xmlns:w10="urn:schemas-microsoft-com:office:word" xmlns:w="http://schemas.openxmlformats.org/wordprocessingml/2006/main" xmlns:w14="http://schemas.microsoft.com/office/word/2010/wordml" xmlns:w15="http://schemas.microsoft.com/office/word/2012/wordml" xmlns:w16cex="http://schemas.microsoft.com/office/word/2018/wordml/cex" xmlns:w16cid="http://schemas.microsoft.com/office/word/2016/wordml/cid" xmlns:w16="http://schemas.microsoft.com/office/word/2018/wordml" xmlns:w16sdtdh="http://schemas.microsoft.com/office/word/2020/wordml/sdtdatahash" xmlns:w16se="http://schemas.microsoft.com/office/word/2015/wordml/symex" xmlns:wpg="http://schemas.microsoft.com/office/word/2010/wordprocessingGroup" xmlns:wpi="http://schemas.microsoft.com/office/word/2010/wordprocessingInk" xmlns:wne="http://schemas.microsoft.com/office/word/2006/wordml" xmlns:wps="http://schemas.microsoft.com/office/word/2010/wordprocessingShape" mc:Ignorable="w14 w15 w16se w16cid w16 w16cex w16sdtdh wp14">
+  <w:footnote w:type="separator" w:id="-1">
+    <w:p>
+      <w:pPr>
+        <w:spacing w:after="0" w:line="240" w:lineRule="auto"/>
+      </w:pPr>
+      <w:r>
+        <w:separator/>
+      </w:r>
+    </w:p>
+  </w:footnote>
+  <w:footnote w:type="continuationSeparator" w:id="0">
+    <w:p>
+      <w:pPr>
+        <w:spacing w:after="0" w:line="240" w:lineRule="auto"/>
+      </w:pPr>
+      <w:r>
+        <w:continuationSeparator/>
+      </w:r>
+    </w:p>
+  </w:footnote>
+</w:footnotes>
 </file>
 
 <file path=word/numbering.xml><?xml version="1.0" encoding="utf-8"?>
@@ -5273,6 +6042,31 @@
       </w:tblBorders>
     </w:tblPr>
   </w:style>
+  <w:style w:type="paragraph" w:styleId="Encabezado">
+    <w:name w:val="header"/>
+    <w:basedOn w:val="Normal"/>
+    <w:link w:val="EncabezadoCar"/>
+    <w:uiPriority w:val="99"/>
+    <w:unhideWhenUsed/>
+    <w:rsid w:val="00C8306A"/>
+    <w:pPr>
+      <w:tabs>
+        <w:tab w:val="center" w:pos="4419"/>
+        <w:tab w:val="right" w:pos="8838"/>
+      </w:tabs>
+      <w:spacing w:after="0" w:line="240" w:lineRule="auto"/>
+    </w:pPr>
+  </w:style>
+  <w:style w:type="character" w:customStyle="1" w:styleId="EncabezadoCar">
+    <w:name w:val="Encabezado Car"/>
+    <w:basedOn w:val="Fuentedeprrafopredeter"/>
+    <w:link w:val="Encabezado"/>
+    <w:uiPriority w:val="99"/>
+    <w:rsid w:val="00C8306A"/>
+    <w:rPr>
+      <w:lang w:val="es-GT"/>
+    </w:rPr>
+  </w:style>
 </w:styles>
 </file>
 

</xml_diff>

<commit_message>
feat(avance2): entidad movimiento, relacion, DTOs, validaciones, excepciones y reglas de negocio
</commit_message>
<xml_diff>
--- a/farmacia/evidencia/Universidad Mariano Gálvez de Guatemala.docx
+++ b/farmacia/evidencia/Universidad Mariano Gálvez de Guatemala.docx
@@ -20,7 +20,66 @@
           <w:sz w:val="24"/>
           <w14:ligatures w14:val="none"/>
         </w:rPr>
-        <w:t>Ing. Allan Federico González Barrueto</w:t>
+        <w:t>Universidad Mariano Gálvez, Guatemala</w:t>
+      </w:r>
+    </w:p>
+    <w:p>
+      <w:pPr>
+        <w:spacing w:line="480" w:lineRule="auto"/>
+        <w:jc w:val="center"/>
+        <w:rPr>
+          <w:rFonts w:ascii="Times New Roman" w:eastAsia="Calibri" w:hAnsi="Times New Roman" w:cs="Times New Roman"/>
+          <w:kern w:val="0"/>
+          <w:sz w:val="24"/>
+          <w14:ligatures w14:val="none"/>
+        </w:rPr>
+      </w:pPr>
+      <w:r>
+        <w:rPr>
+          <w:rFonts w:ascii="Times New Roman" w:eastAsia="Calibri" w:hAnsi="Times New Roman" w:cs="Times New Roman"/>
+          <w:kern w:val="0"/>
+          <w:sz w:val="24"/>
+          <w14:ligatures w14:val="none"/>
+        </w:rPr>
+        <w:t>I</w:t>
+      </w:r>
+      <w:r>
+        <w:rPr>
+          <w:rFonts w:ascii="Times New Roman" w:eastAsia="Calibri" w:hAnsi="Times New Roman" w:cs="Times New Roman"/>
+          <w:kern w:val="0"/>
+          <w:sz w:val="24"/>
+          <w14:ligatures w14:val="none"/>
+        </w:rPr>
+        <w:t xml:space="preserve">ng. </w:t>
+      </w:r>
+      <w:r>
+        <w:rPr>
+          <w:rFonts w:ascii="Times New Roman" w:eastAsia="Calibri" w:hAnsi="Times New Roman" w:cs="Times New Roman"/>
+          <w:kern w:val="0"/>
+          <w:sz w:val="24"/>
+          <w14:ligatures w14:val="none"/>
+        </w:rPr>
+        <w:t xml:space="preserve">David Jonathan </w:t>
+      </w:r>
+      <w:proofErr w:type="spellStart"/>
+      <w:r>
+        <w:rPr>
+          <w:rFonts w:ascii="Times New Roman" w:eastAsia="Calibri" w:hAnsi="Times New Roman" w:cs="Times New Roman"/>
+          <w:kern w:val="0"/>
+          <w:sz w:val="24"/>
+          <w14:ligatures w14:val="none"/>
+        </w:rPr>
+        <w:t>Alvarez</w:t>
+      </w:r>
+      <w:proofErr w:type="spellEnd"/>
+      <w:r>
+        <w:rPr>
+          <w:rFonts w:ascii="Times New Roman" w:eastAsia="Calibri" w:hAnsi="Times New Roman" w:cs="Times New Roman"/>
+          <w:kern w:val="0"/>
+          <w:sz w:val="24"/>
+          <w14:ligatures w14:val="none"/>
+        </w:rPr>
+        <w:t xml:space="preserve"> Escobar</w:t>
       </w:r>
     </w:p>
     <w:p>
@@ -64,7 +123,16 @@
           <w:sz w:val="24"/>
           <w14:ligatures w14:val="none"/>
         </w:rPr>
-        <w:t>Estadística I</w:t>
+        <w:t>Programación I</w:t>
+      </w:r>
+      <w:r>
+        <w:rPr>
+          <w:rFonts w:ascii="Times New Roman" w:eastAsia="Calibri" w:hAnsi="Times New Roman" w:cs="Times New Roman"/>
+          <w:kern w:val="0"/>
+          <w:sz w:val="24"/>
+          <w14:ligatures w14:val="none"/>
+        </w:rPr>
+        <w:t>I</w:t>
       </w:r>
     </w:p>
     <w:p>
@@ -133,7 +201,7 @@
                     </pic:cNvPicPr>
                   </pic:nvPicPr>
                   <pic:blipFill>
-                    <a:blip r:embed="rId7" cstate="print">
+                    <a:blip r:embed="rId8" cstate="print">
                       <a:alphaModFix amt="35000"/>
                       <a:extLst>
                         <a:ext uri="{28A0092B-C50C-407E-A947-70E740481C1C}">
@@ -354,32 +422,11 @@
           <w:rFonts w:ascii="Times New Roman" w:eastAsia="Calibri" w:hAnsi="Times New Roman" w:cs="Times New Roman"/>
           <w:kern w:val="0"/>
           <w:sz w:val="24"/>
-          <w14:ligatures w14:val="none"/>
-        </w:rPr>
-      </w:pPr>
-      <w:r>
-        <w:rPr>
-          <w:rFonts w:ascii="Times New Roman" w:eastAsia="Calibri" w:hAnsi="Times New Roman" w:cs="Times New Roman"/>
-          <w:kern w:val="0"/>
-          <w:sz w:val="24"/>
-          <w14:ligatures w14:val="none"/>
-        </w:rPr>
-        <w:t>Universidad Mariano Gálvez, Guatemala</w:t>
-      </w:r>
-    </w:p>
-    <w:p>
-      <w:pPr>
-        <w:spacing w:line="480" w:lineRule="auto"/>
-        <w:jc w:val="center"/>
-        <w:rPr>
-          <w:rFonts w:ascii="Times New Roman" w:eastAsia="Calibri" w:hAnsi="Times New Roman" w:cs="Times New Roman"/>
-          <w:kern w:val="0"/>
-          <w:sz w:val="24"/>
           <w:lang w:eastAsia="es-GT"/>
           <w14:ligatures w14:val="none"/>
         </w:rPr>
         <w:sectPr>
-          <w:footerReference w:type="default" r:id="rId8"/>
+          <w:footerReference w:type="default" r:id="rId9"/>
           <w:pgSz w:w="12240" w:h="15840" w:code="1"/>
           <w:pgMar w:top="1440" w:right="1440" w:bottom="1440" w:left="1440" w:header="709" w:footer="709" w:gutter="0"/>
           <w:pgNumType w:start="12"/>
@@ -405,7 +452,7 @@
           <w:lang w:eastAsia="es-GT"/>
           <w14:ligatures w14:val="none"/>
         </w:rPr>
-        <w:t>septiembre</w:t>
+        <w:t>octubre</w:t>
       </w:r>
       <w:r>
         <w:rPr>
@@ -438,7 +485,7 @@
       </w:r>
     </w:p>
     <w:p>
-      <w:hyperlink r:id="rId9" w:history="1">
+      <w:hyperlink r:id="rId10" w:history="1">
         <w:r>
           <w:rPr>
             <w:rStyle w:val="Hipervnculo"/>
@@ -502,7 +549,7 @@
                     </pic:cNvPicPr>
                   </pic:nvPicPr>
                   <pic:blipFill>
-                    <a:blip r:embed="rId10">
+                    <a:blip r:embed="rId11">
                       <a:extLst>
                         <a:ext uri="{28A0092B-C50C-407E-A947-70E740481C1C}">
                           <a14:useLocalDpi xmlns:a14="http://schemas.microsoft.com/office/drawing/2010/main" val="0"/>
@@ -564,7 +611,7 @@
                     </pic:cNvPicPr>
                   </pic:nvPicPr>
                   <pic:blipFill>
-                    <a:blip r:embed="rId11">
+                    <a:blip r:embed="rId12">
                       <a:extLst>
                         <a:ext uri="{28A0092B-C50C-407E-A947-70E740481C1C}">
                           <a14:useLocalDpi xmlns:a14="http://schemas.microsoft.com/office/drawing/2010/main" val="0"/>
@@ -604,6 +651,7 @@
       </w:pPr>
       <w:r>
         <w:rPr>
+          <w:noProof/>
           <w:lang w:val="es-MX"/>
         </w:rPr>
         <w:lastRenderedPageBreak/>
@@ -612,54 +660,6 @@
             <wp:extent cx="5612130" cy="4647565"/>
             <wp:effectExtent l="0" t="0" r="7620" b="635"/>
             <wp:docPr id="1" name="Imagen 1"/>
-            <wp:cNvGraphicFramePr>
-              <a:graphicFrameLocks xmlns:a="http://schemas.openxmlformats.org/drawingml/2006/main" noChangeAspect="1"/>
-            </wp:cNvGraphicFramePr>
-            <a:graphic xmlns:a="http://schemas.openxmlformats.org/drawingml/2006/main">
-              <a:graphicData uri="http://schemas.openxmlformats.org/drawingml/2006/picture">
-                <pic:pic xmlns:pic="http://schemas.openxmlformats.org/drawingml/2006/picture">
-                  <pic:nvPicPr>
-                    <pic:cNvPr id="1" name=""/>
-                    <pic:cNvPicPr/>
-                  </pic:nvPicPr>
-                  <pic:blipFill>
-                    <a:blip r:embed="rId12"/>
-                    <a:stretch>
-                      <a:fillRect/>
-                    </a:stretch>
-                  </pic:blipFill>
-                  <pic:spPr>
-                    <a:xfrm>
-                      <a:off x="0" y="0"/>
-                      <a:ext cx="5612130" cy="4647565"/>
-                    </a:xfrm>
-                    <a:prstGeom prst="rect">
-                      <a:avLst/>
-                    </a:prstGeom>
-                  </pic:spPr>
-                </pic:pic>
-              </a:graphicData>
-            </a:graphic>
-          </wp:inline>
-        </w:drawing>
-      </w:r>
-    </w:p>
-    <w:p>
-      <w:pPr>
-        <w:rPr>
-          <w:noProof/>
-        </w:rPr>
-      </w:pPr>
-      <w:r>
-        <w:rPr>
-          <w:lang w:val="es-MX"/>
-        </w:rPr>
-        <w:lastRenderedPageBreak/>
-        <w:drawing>
-          <wp:inline distT="0" distB="0" distL="0" distR="0" wp14:anchorId="6871DEAD" wp14:editId="507D2751">
-            <wp:extent cx="5612130" cy="4081780"/>
-            <wp:effectExtent l="0" t="0" r="7620" b="0"/>
-            <wp:docPr id="2" name="Imagen 2"/>
             <wp:cNvGraphicFramePr>
               <a:graphicFrameLocks xmlns:a="http://schemas.openxmlformats.org/drawingml/2006/main" noChangeAspect="1"/>
             </wp:cNvGraphicFramePr>
@@ -679,7 +679,7 @@
                   <pic:spPr>
                     <a:xfrm>
                       <a:off x="0" y="0"/>
-                      <a:ext cx="5612130" cy="4081780"/>
+                      <a:ext cx="5612130" cy="4647565"/>
                     </a:xfrm>
                     <a:prstGeom prst="rect">
                       <a:avLst/>
@@ -691,21 +691,24 @@
           </wp:inline>
         </w:drawing>
       </w:r>
-      <w:r>
+    </w:p>
+    <w:p>
+      <w:pPr>
         <w:rPr>
           <w:noProof/>
         </w:rPr>
-        <w:t xml:space="preserve"> </w:t>
-      </w:r>
-      <w:r>
-        <w:rPr>
+      </w:pPr>
+      <w:r>
+        <w:rPr>
+          <w:noProof/>
           <w:lang w:val="es-MX"/>
         </w:rPr>
+        <w:lastRenderedPageBreak/>
         <w:drawing>
-          <wp:inline distT="0" distB="0" distL="0" distR="0" wp14:anchorId="387E09F0" wp14:editId="4661988E">
-            <wp:extent cx="5612130" cy="2124075"/>
-            <wp:effectExtent l="0" t="0" r="7620" b="9525"/>
-            <wp:docPr id="3" name="Imagen 3"/>
+          <wp:inline distT="0" distB="0" distL="0" distR="0" wp14:anchorId="6871DEAD" wp14:editId="507D2751">
+            <wp:extent cx="5612130" cy="4081780"/>
+            <wp:effectExtent l="0" t="0" r="7620" b="0"/>
+            <wp:docPr id="2" name="Imagen 2"/>
             <wp:cNvGraphicFramePr>
               <a:graphicFrameLocks xmlns:a="http://schemas.openxmlformats.org/drawingml/2006/main" noChangeAspect="1"/>
             </wp:cNvGraphicFramePr>
@@ -725,7 +728,7 @@
                   <pic:spPr>
                     <a:xfrm>
                       <a:off x="0" y="0"/>
-                      <a:ext cx="5612130" cy="2124075"/>
+                      <a:ext cx="5612130" cy="4081780"/>
                     </a:xfrm>
                     <a:prstGeom prst="rect">
                       <a:avLst/>
@@ -737,29 +740,22 @@
           </wp:inline>
         </w:drawing>
       </w:r>
-    </w:p>
-    <w:p/>
-    <w:p/>
-    <w:p/>
-    <w:p/>
-    <w:p/>
-    <w:p/>
-    <w:p>
-      <w:pPr>
-        <w:pStyle w:val="Ttulo1"/>
-      </w:pPr>
-      <w:r>
-        <w:lastRenderedPageBreak/>
-        <w:t>Estructura del Proyecto</w:t>
-      </w:r>
-    </w:p>
-    <w:p>
-      <w:r>
+      <w:r>
+        <w:rPr>
+          <w:noProof/>
+        </w:rPr>
+        <w:t xml:space="preserve"> </w:t>
+      </w:r>
+      <w:r>
+        <w:rPr>
+          <w:noProof/>
+          <w:lang w:val="es-MX"/>
+        </w:rPr>
         <w:drawing>
-          <wp:inline distT="0" distB="0" distL="0" distR="0" wp14:anchorId="3DCF5B91" wp14:editId="56F8AA68">
-            <wp:extent cx="4934639" cy="7268589"/>
-            <wp:effectExtent l="0" t="0" r="0" b="8890"/>
-            <wp:docPr id="4" name="Imagen 4"/>
+          <wp:inline distT="0" distB="0" distL="0" distR="0" wp14:anchorId="387E09F0" wp14:editId="4661988E">
+            <wp:extent cx="5612130" cy="2124075"/>
+            <wp:effectExtent l="0" t="0" r="7620" b="9525"/>
+            <wp:docPr id="3" name="Imagen 3"/>
             <wp:cNvGraphicFramePr>
               <a:graphicFrameLocks xmlns:a="http://schemas.openxmlformats.org/drawingml/2006/main" noChangeAspect="1"/>
             </wp:cNvGraphicFramePr>
@@ -779,6 +775,63 @@
                   <pic:spPr>
                     <a:xfrm>
                       <a:off x="0" y="0"/>
+                      <a:ext cx="5612130" cy="2124075"/>
+                    </a:xfrm>
+                    <a:prstGeom prst="rect">
+                      <a:avLst/>
+                    </a:prstGeom>
+                  </pic:spPr>
+                </pic:pic>
+              </a:graphicData>
+            </a:graphic>
+          </wp:inline>
+        </w:drawing>
+      </w:r>
+    </w:p>
+    <w:p/>
+    <w:p/>
+    <w:p/>
+    <w:p/>
+    <w:p/>
+    <w:p/>
+    <w:p>
+      <w:pPr>
+        <w:pStyle w:val="Ttulo1"/>
+      </w:pPr>
+      <w:r>
+        <w:lastRenderedPageBreak/>
+        <w:t>Estructura del Proyecto</w:t>
+      </w:r>
+    </w:p>
+    <w:p>
+      <w:r>
+        <w:rPr>
+          <w:noProof/>
+        </w:rPr>
+        <w:drawing>
+          <wp:inline distT="0" distB="0" distL="0" distR="0" wp14:anchorId="3DCF5B91" wp14:editId="56F8AA68">
+            <wp:extent cx="4934639" cy="7268589"/>
+            <wp:effectExtent l="0" t="0" r="0" b="8890"/>
+            <wp:docPr id="4" name="Imagen 4"/>
+            <wp:cNvGraphicFramePr>
+              <a:graphicFrameLocks xmlns:a="http://schemas.openxmlformats.org/drawingml/2006/main" noChangeAspect="1"/>
+            </wp:cNvGraphicFramePr>
+            <a:graphic xmlns:a="http://schemas.openxmlformats.org/drawingml/2006/main">
+              <a:graphicData uri="http://schemas.openxmlformats.org/drawingml/2006/picture">
+                <pic:pic xmlns:pic="http://schemas.openxmlformats.org/drawingml/2006/picture">
+                  <pic:nvPicPr>
+                    <pic:cNvPr id="1" name=""/>
+                    <pic:cNvPicPr/>
+                  </pic:nvPicPr>
+                  <pic:blipFill>
+                    <a:blip r:embed="rId16"/>
+                    <a:stretch>
+                      <a:fillRect/>
+                    </a:stretch>
+                  </pic:blipFill>
+                  <pic:spPr>
+                    <a:xfrm>
+                      <a:off x="0" y="0"/>
                       <a:ext cx="4934639" cy="7268589"/>
                     </a:xfrm>
                     <a:prstGeom prst="rect">
@@ -825,7 +878,7 @@
                     </pic:cNvPicPr>
                   </pic:nvPicPr>
                   <pic:blipFill>
-                    <a:blip r:embed="rId16">
+                    <a:blip r:embed="rId17">
                       <a:extLst>
                         <a:ext uri="{28A0092B-C50C-407E-A947-70E740481C1C}">
                           <a14:useLocalDpi xmlns:a14="http://schemas.microsoft.com/office/drawing/2010/main" val="0"/>
@@ -890,7 +943,7 @@
                     </pic:cNvPicPr>
                   </pic:nvPicPr>
                   <pic:blipFill>
-                    <a:blip r:embed="rId17">
+                    <a:blip r:embed="rId18">
                       <a:extLst>
                         <a:ext uri="{28A0092B-C50C-407E-A947-70E740481C1C}">
                           <a14:useLocalDpi xmlns:a14="http://schemas.microsoft.com/office/drawing/2010/main" val="0"/>
@@ -943,7 +996,7 @@
                     </pic:cNvPicPr>
                   </pic:nvPicPr>
                   <pic:blipFill>
-                    <a:blip r:embed="rId18" cstate="print">
+                    <a:blip r:embed="rId19" cstate="print">
                       <a:extLst>
                         <a:ext uri="{28A0092B-C50C-407E-A947-70E740481C1C}">
                           <a14:useLocalDpi xmlns:a14="http://schemas.microsoft.com/office/drawing/2010/main" val="0"/>
@@ -999,7 +1052,7 @@
                     </pic:cNvPicPr>
                   </pic:nvPicPr>
                   <pic:blipFill>
-                    <a:blip r:embed="rId19">
+                    <a:blip r:embed="rId20">
                       <a:extLst>
                         <a:ext uri="{28A0092B-C50C-407E-A947-70E740481C1C}">
                           <a14:useLocalDpi xmlns:a14="http://schemas.microsoft.com/office/drawing/2010/main" val="0"/>
@@ -1052,7 +1105,7 @@
                     </pic:cNvPicPr>
                   </pic:nvPicPr>
                   <pic:blipFill>
-                    <a:blip r:embed="rId20">
+                    <a:blip r:embed="rId21">
                       <a:extLst>
                         <a:ext uri="{28A0092B-C50C-407E-A947-70E740481C1C}">
                           <a14:useLocalDpi xmlns:a14="http://schemas.microsoft.com/office/drawing/2010/main" val="0"/>
@@ -1106,7 +1159,7 @@
                     </pic:cNvPicPr>
                   </pic:nvPicPr>
                   <pic:blipFill>
-                    <a:blip r:embed="rId21">
+                    <a:blip r:embed="rId22">
                       <a:extLst>
                         <a:ext uri="{28A0092B-C50C-407E-A947-70E740481C1C}">
                           <a14:useLocalDpi xmlns:a14="http://schemas.microsoft.com/office/drawing/2010/main" val="0"/>
@@ -1313,7 +1366,7 @@
                     </pic:cNvPicPr>
                   </pic:nvPicPr>
                   <pic:blipFill>
-                    <a:blip r:embed="rId22">
+                    <a:blip r:embed="rId23">
                       <a:extLst>
                         <a:ext uri="{28A0092B-C50C-407E-A947-70E740481C1C}">
                           <a14:useLocalDpi xmlns:a14="http://schemas.microsoft.com/office/drawing/2010/main" val="0"/>
@@ -1366,7 +1419,7 @@
                     </pic:cNvPicPr>
                   </pic:nvPicPr>
                   <pic:blipFill>
-                    <a:blip r:embed="rId23" cstate="print">
+                    <a:blip r:embed="rId24" cstate="print">
                       <a:extLst>
                         <a:ext uri="{28A0092B-C50C-407E-A947-70E740481C1C}">
                           <a14:useLocalDpi xmlns:a14="http://schemas.microsoft.com/office/drawing/2010/main" val="0"/>
@@ -1419,7 +1472,7 @@
                     </pic:cNvPicPr>
                   </pic:nvPicPr>
                   <pic:blipFill>
-                    <a:blip r:embed="rId24">
+                    <a:blip r:embed="rId25">
                       <a:extLst>
                         <a:ext uri="{28A0092B-C50C-407E-A947-70E740481C1C}">
                           <a14:useLocalDpi xmlns:a14="http://schemas.microsoft.com/office/drawing/2010/main" val="0"/>
@@ -1543,7 +1596,7 @@
                     </pic:cNvPicPr>
                   </pic:nvPicPr>
                   <pic:blipFill>
-                    <a:blip r:embed="rId25">
+                    <a:blip r:embed="rId26">
                       <a:extLst>
                         <a:ext uri="{28A0092B-C50C-407E-A947-70E740481C1C}">
                           <a14:useLocalDpi xmlns:a14="http://schemas.microsoft.com/office/drawing/2010/main" val="0"/>
@@ -1597,7 +1650,7 @@
                     </pic:cNvPicPr>
                   </pic:nvPicPr>
                   <pic:blipFill>
-                    <a:blip r:embed="rId26" cstate="print">
+                    <a:blip r:embed="rId27" cstate="print">
                       <a:extLst>
                         <a:ext uri="{28A0092B-C50C-407E-A947-70E740481C1C}">
                           <a14:useLocalDpi xmlns:a14="http://schemas.microsoft.com/office/drawing/2010/main" val="0"/>
@@ -1635,7 +1688,1781 @@
           <w:lang w:val="es-MX"/>
         </w:rPr>
       </w:pPr>
-    </w:p>
+      <w:r>
+        <w:rPr>
+          <w:lang w:val="es-MX"/>
+        </w:rPr>
+        <w:br w:type="page"/>
+      </w:r>
+    </w:p>
+    <w:p>
+      <w:pPr>
+        <w:pStyle w:val="Ttulo1"/>
+      </w:pPr>
+      <w:r>
+        <w:lastRenderedPageBreak/>
+        <w:t>Avance 1.5 – correcciones</w:t>
+      </w:r>
+    </w:p>
+    <w:p>
+      <w:pPr>
+        <w:pStyle w:val="Ttulo3"/>
+        <w:shd w:val="clear" w:color="auto" w:fill="FFFFFF"/>
+        <w:spacing w:before="480" w:after="240" w:line="450" w:lineRule="atLeast"/>
+        <w:rPr>
+          <w:rFonts w:ascii="Segoe UI" w:hAnsi="Segoe UI" w:cs="Segoe UI"/>
+          <w:color w:val="0F1115"/>
+          <w:sz w:val="30"/>
+          <w:szCs w:val="30"/>
+          <w:lang w:val="es-MX"/>
+        </w:rPr>
+      </w:pPr>
+      <w:r>
+        <w:rPr>
+          <w:rFonts w:ascii="Segoe UI" w:hAnsi="Segoe UI" w:cs="Segoe UI"/>
+          <w:color w:val="0F1115"/>
+          <w:sz w:val="30"/>
+          <w:szCs w:val="30"/>
+        </w:rPr>
+        <w:t>Corrección 1: Quitar la contraseña del código (</w:t>
+      </w:r>
+      <w:proofErr w:type="spellStart"/>
+      <w:proofErr w:type="gramStart"/>
+      <w:r>
+        <w:rPr>
+          <w:rFonts w:ascii="Segoe UI" w:hAnsi="Segoe UI" w:cs="Segoe UI"/>
+          <w:color w:val="0F1115"/>
+          <w:sz w:val="30"/>
+          <w:szCs w:val="30"/>
+        </w:rPr>
+        <w:t>application.properties</w:t>
+      </w:r>
+      <w:proofErr w:type="spellEnd"/>
+      <w:proofErr w:type="gramEnd"/>
+      <w:r>
+        <w:rPr>
+          <w:rFonts w:ascii="Segoe UI" w:hAnsi="Segoe UI" w:cs="Segoe UI"/>
+          <w:color w:val="0F1115"/>
+          <w:sz w:val="30"/>
+          <w:szCs w:val="30"/>
+        </w:rPr>
+        <w:t>)</w:t>
+      </w:r>
+    </w:p>
+    <w:p>
+      <w:pPr>
+        <w:rPr>
+          <w:lang w:val="es-MX"/>
+        </w:rPr>
+      </w:pPr>
+      <w:r>
+        <w:rPr>
+          <w:noProof/>
+        </w:rPr>
+        <w:drawing>
+          <wp:inline distT="0" distB="0" distL="0" distR="0" wp14:anchorId="5135505B" wp14:editId="599FFA5B">
+            <wp:extent cx="5593941" cy="6305550"/>
+            <wp:effectExtent l="0" t="0" r="6985" b="0"/>
+            <wp:docPr id="6" name="Imagen 6"/>
+            <wp:cNvGraphicFramePr>
+              <a:graphicFrameLocks xmlns:a="http://schemas.openxmlformats.org/drawingml/2006/main" noChangeAspect="1"/>
+            </wp:cNvGraphicFramePr>
+            <a:graphic xmlns:a="http://schemas.openxmlformats.org/drawingml/2006/main">
+              <a:graphicData uri="http://schemas.openxmlformats.org/drawingml/2006/picture">
+                <pic:pic xmlns:pic="http://schemas.openxmlformats.org/drawingml/2006/picture">
+                  <pic:nvPicPr>
+                    <pic:cNvPr id="1" name=""/>
+                    <pic:cNvPicPr/>
+                  </pic:nvPicPr>
+                  <pic:blipFill rotWithShape="1">
+                    <a:blip r:embed="rId28"/>
+                    <a:srcRect r="50102"/>
+                    <a:stretch/>
+                  </pic:blipFill>
+                  <pic:spPr bwMode="auto">
+                    <a:xfrm>
+                      <a:off x="0" y="0"/>
+                      <a:ext cx="5599110" cy="6311377"/>
+                    </a:xfrm>
+                    <a:prstGeom prst="rect">
+                      <a:avLst/>
+                    </a:prstGeom>
+                    <a:ln>
+                      <a:noFill/>
+                    </a:ln>
+                    <a:extLst>
+                      <a:ext uri="{53640926-AAD7-44D8-BBD7-CCE9431645EC}">
+                        <a14:shadowObscured xmlns:a14="http://schemas.microsoft.com/office/drawing/2010/main"/>
+                      </a:ext>
+                    </a:extLst>
+                  </pic:spPr>
+                </pic:pic>
+              </a:graphicData>
+            </a:graphic>
+          </wp:inline>
+        </w:drawing>
+      </w:r>
+    </w:p>
+    <w:p>
+      <w:pPr>
+        <w:rPr>
+          <w:lang w:val="es-MX"/>
+        </w:rPr>
+      </w:pPr>
+      <w:r>
+        <w:rPr>
+          <w:lang w:val="es-MX"/>
+        </w:rPr>
+        <w:lastRenderedPageBreak/>
+        <w:drawing>
+          <wp:inline distT="0" distB="0" distL="0" distR="0" wp14:anchorId="0237CA27" wp14:editId="7EE0CD0E">
+            <wp:extent cx="5612130" cy="2695575"/>
+            <wp:effectExtent l="0" t="0" r="7620" b="9525"/>
+            <wp:docPr id="7" name="Imagen 7"/>
+            <wp:cNvGraphicFramePr>
+              <a:graphicFrameLocks xmlns:a="http://schemas.openxmlformats.org/drawingml/2006/main" noChangeAspect="1"/>
+            </wp:cNvGraphicFramePr>
+            <a:graphic xmlns:a="http://schemas.openxmlformats.org/drawingml/2006/main">
+              <a:graphicData uri="http://schemas.openxmlformats.org/drawingml/2006/picture">
+                <pic:pic xmlns:pic="http://schemas.openxmlformats.org/drawingml/2006/picture">
+                  <pic:nvPicPr>
+                    <pic:cNvPr id="1" name=""/>
+                    <pic:cNvPicPr/>
+                  </pic:nvPicPr>
+                  <pic:blipFill>
+                    <a:blip r:embed="rId29"/>
+                    <a:stretch>
+                      <a:fillRect/>
+                    </a:stretch>
+                  </pic:blipFill>
+                  <pic:spPr>
+                    <a:xfrm>
+                      <a:off x="0" y="0"/>
+                      <a:ext cx="5612130" cy="2695575"/>
+                    </a:xfrm>
+                    <a:prstGeom prst="rect">
+                      <a:avLst/>
+                    </a:prstGeom>
+                  </pic:spPr>
+                </pic:pic>
+              </a:graphicData>
+            </a:graphic>
+          </wp:inline>
+        </w:drawing>
+      </w:r>
+      <w:r>
+        <w:rPr>
+          <w:lang w:val="es-MX"/>
+        </w:rPr>
+        <w:drawing>
+          <wp:inline distT="0" distB="0" distL="0" distR="0" wp14:anchorId="577983BE" wp14:editId="1275DDBB">
+            <wp:extent cx="5612130" cy="1303020"/>
+            <wp:effectExtent l="0" t="0" r="7620" b="0"/>
+            <wp:docPr id="9" name="Imagen 9"/>
+            <wp:cNvGraphicFramePr>
+              <a:graphicFrameLocks xmlns:a="http://schemas.openxmlformats.org/drawingml/2006/main" noChangeAspect="1"/>
+            </wp:cNvGraphicFramePr>
+            <a:graphic xmlns:a="http://schemas.openxmlformats.org/drawingml/2006/main">
+              <a:graphicData uri="http://schemas.openxmlformats.org/drawingml/2006/picture">
+                <pic:pic xmlns:pic="http://schemas.openxmlformats.org/drawingml/2006/picture">
+                  <pic:nvPicPr>
+                    <pic:cNvPr id="1" name=""/>
+                    <pic:cNvPicPr/>
+                  </pic:nvPicPr>
+                  <pic:blipFill>
+                    <a:blip r:embed="rId30"/>
+                    <a:stretch>
+                      <a:fillRect/>
+                    </a:stretch>
+                  </pic:blipFill>
+                  <pic:spPr>
+                    <a:xfrm>
+                      <a:off x="0" y="0"/>
+                      <a:ext cx="5612130" cy="1303020"/>
+                    </a:xfrm>
+                    <a:prstGeom prst="rect">
+                      <a:avLst/>
+                    </a:prstGeom>
+                  </pic:spPr>
+                </pic:pic>
+              </a:graphicData>
+            </a:graphic>
+          </wp:inline>
+        </w:drawing>
+      </w:r>
+    </w:p>
+    <w:p>
+      <w:pPr>
+        <w:rPr>
+          <w:lang w:val="es-MX"/>
+        </w:rPr>
+      </w:pPr>
+      <w:r>
+        <w:rPr>
+          <w:lang w:val="es-MX"/>
+        </w:rPr>
+        <w:br w:type="page"/>
+      </w:r>
+    </w:p>
+    <w:p>
+      <w:pPr>
+        <w:pStyle w:val="Ttulo1"/>
+      </w:pPr>
+      <w:r>
+        <w:lastRenderedPageBreak/>
+        <w:t>Avance 2</w:t>
+      </w:r>
+    </w:p>
+    <w:p>
+      <w:r>
+        <w:t xml:space="preserve">Entidad </w:t>
+      </w:r>
+      <w:proofErr w:type="spellStart"/>
+      <w:r>
+        <w:t>MovimientoInventario</w:t>
+      </w:r>
+      <w:proofErr w:type="spellEnd"/>
+      <w:r>
+        <w:t xml:space="preserve"> creada y relacionada con Medicamento mediante JPA.</w:t>
+      </w:r>
+    </w:p>
+    <w:p>
+      <w:r>
+        <w:t xml:space="preserve">Creación de </w:t>
+      </w:r>
+      <w:proofErr w:type="spellStart"/>
+      <w:r>
+        <w:t>DTOs</w:t>
+      </w:r>
+      <w:proofErr w:type="spellEnd"/>
+      <w:r>
+        <w:t xml:space="preserve"> para controlar los datos de entrada y salida.</w:t>
+      </w:r>
+    </w:p>
+    <w:p>
+      <w:r>
+        <w:t xml:space="preserve">Implementación de validaciones en los </w:t>
+      </w:r>
+      <w:proofErr w:type="spellStart"/>
+      <w:r>
+        <w:t>DTOs</w:t>
+      </w:r>
+      <w:proofErr w:type="spellEnd"/>
+      <w:r>
+        <w:t>.</w:t>
+      </w:r>
+    </w:p>
+    <w:p>
+      <w:r>
+        <w:t>CRUD completo para Medicamento</w:t>
+      </w:r>
+      <w:r>
+        <w:t>s</w:t>
+      </w:r>
+      <w:r>
+        <w:t>.</w:t>
+      </w:r>
+    </w:p>
+    <w:p>
+      <w:r>
+        <w:t>Implementación del Manejo Centralizado de Excepciones, devolviendo errores 404, 400 y 409.</w:t>
+      </w:r>
+    </w:p>
+    <w:p>
+      <w:r>
+        <w:t>Implementación de los dos filtros solicitados: Búsqueda por Categoría y Búsqueda de Stock Bajo.</w:t>
+      </w:r>
+    </w:p>
+    <w:p>
+      <w:r>
+        <w:t>Registro de movimientos actualizando automáticamente el stock del medicamento.</w:t>
+      </w:r>
+    </w:p>
+    <w:p>
+      <w:r>
+        <w:t xml:space="preserve"> Regla de Negocio: Validación que impide realizar una salida mayor al stock disponible, lanzando un error 409 </w:t>
+      </w:r>
+      <w:proofErr w:type="spellStart"/>
+      <w:r>
+        <w:t>Conflict</w:t>
+      </w:r>
+      <w:proofErr w:type="spellEnd"/>
+      <w:r>
+        <w:t>.</w:t>
+      </w:r>
+    </w:p>
+    <w:p>
+      <w:pPr>
+        <w:pStyle w:val="Ttulo2"/>
+      </w:pPr>
+      <w:r>
+        <w:t xml:space="preserve">Entidad Movimiento y </w:t>
+      </w:r>
+      <w:proofErr w:type="spellStart"/>
+      <w:r>
+        <w:t>Enum</w:t>
+      </w:r>
+      <w:proofErr w:type="spellEnd"/>
+    </w:p>
+    <w:p>
+      <w:r>
+        <w:drawing>
+          <wp:inline distT="0" distB="0" distL="0" distR="0" wp14:anchorId="2C2337CE" wp14:editId="5E20B5D9">
+            <wp:extent cx="2410161" cy="981212"/>
+            <wp:effectExtent l="0" t="0" r="0" b="9525"/>
+            <wp:docPr id="21" name="Imagen 21"/>
+            <wp:cNvGraphicFramePr>
+              <a:graphicFrameLocks xmlns:a="http://schemas.openxmlformats.org/drawingml/2006/main" noChangeAspect="1"/>
+            </wp:cNvGraphicFramePr>
+            <a:graphic xmlns:a="http://schemas.openxmlformats.org/drawingml/2006/main">
+              <a:graphicData uri="http://schemas.openxmlformats.org/drawingml/2006/picture">
+                <pic:pic xmlns:pic="http://schemas.openxmlformats.org/drawingml/2006/picture">
+                  <pic:nvPicPr>
+                    <pic:cNvPr id="1" name=""/>
+                    <pic:cNvPicPr/>
+                  </pic:nvPicPr>
+                  <pic:blipFill>
+                    <a:blip r:embed="rId31"/>
+                    <a:stretch>
+                      <a:fillRect/>
+                    </a:stretch>
+                  </pic:blipFill>
+                  <pic:spPr>
+                    <a:xfrm>
+                      <a:off x="0" y="0"/>
+                      <a:ext cx="2410161" cy="981212"/>
+                    </a:xfrm>
+                    <a:prstGeom prst="rect">
+                      <a:avLst/>
+                    </a:prstGeom>
+                  </pic:spPr>
+                </pic:pic>
+              </a:graphicData>
+            </a:graphic>
+          </wp:inline>
+        </w:drawing>
+      </w:r>
+    </w:p>
+    <w:p>
+      <w:r>
+        <w:lastRenderedPageBreak/>
+        <w:drawing>
+          <wp:inline distT="0" distB="0" distL="0" distR="0" wp14:anchorId="7ADC7CB9" wp14:editId="77A9B4C6">
+            <wp:extent cx="5268060" cy="6373114"/>
+            <wp:effectExtent l="0" t="0" r="8890" b="8890"/>
+            <wp:docPr id="22" name="Imagen 22"/>
+            <wp:cNvGraphicFramePr>
+              <a:graphicFrameLocks xmlns:a="http://schemas.openxmlformats.org/drawingml/2006/main" noChangeAspect="1"/>
+            </wp:cNvGraphicFramePr>
+            <a:graphic xmlns:a="http://schemas.openxmlformats.org/drawingml/2006/main">
+              <a:graphicData uri="http://schemas.openxmlformats.org/drawingml/2006/picture">
+                <pic:pic xmlns:pic="http://schemas.openxmlformats.org/drawingml/2006/picture">
+                  <pic:nvPicPr>
+                    <pic:cNvPr id="1" name=""/>
+                    <pic:cNvPicPr/>
+                  </pic:nvPicPr>
+                  <pic:blipFill>
+                    <a:blip r:embed="rId32"/>
+                    <a:stretch>
+                      <a:fillRect/>
+                    </a:stretch>
+                  </pic:blipFill>
+                  <pic:spPr>
+                    <a:xfrm>
+                      <a:off x="0" y="0"/>
+                      <a:ext cx="5268060" cy="6373114"/>
+                    </a:xfrm>
+                    <a:prstGeom prst="rect">
+                      <a:avLst/>
+                    </a:prstGeom>
+                  </pic:spPr>
+                </pic:pic>
+              </a:graphicData>
+            </a:graphic>
+          </wp:inline>
+        </w:drawing>
+      </w:r>
+    </w:p>
+    <w:p>
+      <w:r>
+        <w:lastRenderedPageBreak/>
+        <w:drawing>
+          <wp:inline distT="0" distB="0" distL="0" distR="0" wp14:anchorId="456EA64B" wp14:editId="40EE6ADB">
+            <wp:extent cx="5153744" cy="2819794"/>
+            <wp:effectExtent l="0" t="0" r="0" b="0"/>
+            <wp:docPr id="23" name="Imagen 23"/>
+            <wp:cNvGraphicFramePr>
+              <a:graphicFrameLocks xmlns:a="http://schemas.openxmlformats.org/drawingml/2006/main" noChangeAspect="1"/>
+            </wp:cNvGraphicFramePr>
+            <a:graphic xmlns:a="http://schemas.openxmlformats.org/drawingml/2006/main">
+              <a:graphicData uri="http://schemas.openxmlformats.org/drawingml/2006/picture">
+                <pic:pic xmlns:pic="http://schemas.openxmlformats.org/drawingml/2006/picture">
+                  <pic:nvPicPr>
+                    <pic:cNvPr id="1" name=""/>
+                    <pic:cNvPicPr/>
+                  </pic:nvPicPr>
+                  <pic:blipFill>
+                    <a:blip r:embed="rId33"/>
+                    <a:stretch>
+                      <a:fillRect/>
+                    </a:stretch>
+                  </pic:blipFill>
+                  <pic:spPr>
+                    <a:xfrm>
+                      <a:off x="0" y="0"/>
+                      <a:ext cx="5153744" cy="2819794"/>
+                    </a:xfrm>
+                    <a:prstGeom prst="rect">
+                      <a:avLst/>
+                    </a:prstGeom>
+                  </pic:spPr>
+                </pic:pic>
+              </a:graphicData>
+            </a:graphic>
+          </wp:inline>
+        </w:drawing>
+      </w:r>
+    </w:p>
+    <w:p>
+      <w:r>
+        <w:drawing>
+          <wp:inline distT="0" distB="0" distL="0" distR="0" wp14:anchorId="115D4352" wp14:editId="41EC4B80">
+            <wp:extent cx="4515480" cy="1810003"/>
+            <wp:effectExtent l="0" t="0" r="0" b="0"/>
+            <wp:docPr id="24" name="Imagen 24"/>
+            <wp:cNvGraphicFramePr>
+              <a:graphicFrameLocks xmlns:a="http://schemas.openxmlformats.org/drawingml/2006/main" noChangeAspect="1"/>
+            </wp:cNvGraphicFramePr>
+            <a:graphic xmlns:a="http://schemas.openxmlformats.org/drawingml/2006/main">
+              <a:graphicData uri="http://schemas.openxmlformats.org/drawingml/2006/picture">
+                <pic:pic xmlns:pic="http://schemas.openxmlformats.org/drawingml/2006/picture">
+                  <pic:nvPicPr>
+                    <pic:cNvPr id="1" name=""/>
+                    <pic:cNvPicPr/>
+                  </pic:nvPicPr>
+                  <pic:blipFill>
+                    <a:blip r:embed="rId34"/>
+                    <a:stretch>
+                      <a:fillRect/>
+                    </a:stretch>
+                  </pic:blipFill>
+                  <pic:spPr>
+                    <a:xfrm>
+                      <a:off x="0" y="0"/>
+                      <a:ext cx="4515480" cy="1810003"/>
+                    </a:xfrm>
+                    <a:prstGeom prst="rect">
+                      <a:avLst/>
+                    </a:prstGeom>
+                  </pic:spPr>
+                </pic:pic>
+              </a:graphicData>
+            </a:graphic>
+          </wp:inline>
+        </w:drawing>
+      </w:r>
+    </w:p>
+    <w:p/>
+    <w:p/>
+    <w:p/>
+    <w:p/>
+    <w:p/>
+    <w:p/>
+    <w:p/>
+    <w:p/>
+    <w:p/>
+    <w:p/>
+    <w:p/>
+    <w:p>
+      <w:pPr>
+        <w:pStyle w:val="Ttulo2"/>
+      </w:pPr>
+      <w:r>
+        <w:lastRenderedPageBreak/>
+        <w:t>DTO</w:t>
+      </w:r>
+    </w:p>
+    <w:p>
+      <w:r>
+        <w:drawing>
+          <wp:inline distT="0" distB="0" distL="0" distR="0" wp14:anchorId="284BE0E1" wp14:editId="01FED69B">
+            <wp:extent cx="2372056" cy="1009791"/>
+            <wp:effectExtent l="0" t="0" r="9525" b="0"/>
+            <wp:docPr id="28" name="Imagen 28"/>
+            <wp:cNvGraphicFramePr>
+              <a:graphicFrameLocks xmlns:a="http://schemas.openxmlformats.org/drawingml/2006/main" noChangeAspect="1"/>
+            </wp:cNvGraphicFramePr>
+            <a:graphic xmlns:a="http://schemas.openxmlformats.org/drawingml/2006/main">
+              <a:graphicData uri="http://schemas.openxmlformats.org/drawingml/2006/picture">
+                <pic:pic xmlns:pic="http://schemas.openxmlformats.org/drawingml/2006/picture">
+                  <pic:nvPicPr>
+                    <pic:cNvPr id="1" name=""/>
+                    <pic:cNvPicPr/>
+                  </pic:nvPicPr>
+                  <pic:blipFill>
+                    <a:blip r:embed="rId35"/>
+                    <a:stretch>
+                      <a:fillRect/>
+                    </a:stretch>
+                  </pic:blipFill>
+                  <pic:spPr>
+                    <a:xfrm>
+                      <a:off x="0" y="0"/>
+                      <a:ext cx="2372056" cy="1009791"/>
+                    </a:xfrm>
+                    <a:prstGeom prst="rect">
+                      <a:avLst/>
+                    </a:prstGeom>
+                  </pic:spPr>
+                </pic:pic>
+              </a:graphicData>
+            </a:graphic>
+          </wp:inline>
+        </w:drawing>
+      </w:r>
+    </w:p>
+    <w:p>
+      <w:proofErr w:type="spellStart"/>
+      <w:r>
+        <w:t>MedicamentoRequestDTO</w:t>
+      </w:r>
+      <w:proofErr w:type="spellEnd"/>
+    </w:p>
+    <w:p>
+      <w:r>
+        <w:drawing>
+          <wp:anchor distT="0" distB="0" distL="114300" distR="114300" simplePos="0" relativeHeight="251661312" behindDoc="0" locked="0" layoutInCell="1" allowOverlap="1" wp14:anchorId="3310DCB0" wp14:editId="0582734A">
+            <wp:simplePos x="1076325" y="1400175"/>
+            <wp:positionH relativeFrom="column">
+              <wp:align>left</wp:align>
+            </wp:positionH>
+            <wp:positionV relativeFrom="paragraph">
+              <wp:align>top</wp:align>
+            </wp:positionV>
+            <wp:extent cx="5612130" cy="5660390"/>
+            <wp:effectExtent l="0" t="0" r="7620" b="0"/>
+            <wp:wrapSquare wrapText="bothSides"/>
+            <wp:docPr id="25" name="Imagen 25"/>
+            <wp:cNvGraphicFramePr>
+              <a:graphicFrameLocks xmlns:a="http://schemas.openxmlformats.org/drawingml/2006/main" noChangeAspect="1"/>
+            </wp:cNvGraphicFramePr>
+            <a:graphic xmlns:a="http://schemas.openxmlformats.org/drawingml/2006/main">
+              <a:graphicData uri="http://schemas.openxmlformats.org/drawingml/2006/picture">
+                <pic:pic xmlns:pic="http://schemas.openxmlformats.org/drawingml/2006/picture">
+                  <pic:nvPicPr>
+                    <pic:cNvPr id="1" name=""/>
+                    <pic:cNvPicPr/>
+                  </pic:nvPicPr>
+                  <pic:blipFill>
+                    <a:blip r:embed="rId36">
+                      <a:extLst>
+                        <a:ext uri="{28A0092B-C50C-407E-A947-70E740481C1C}">
+                          <a14:useLocalDpi xmlns:a14="http://schemas.microsoft.com/office/drawing/2010/main" val="0"/>
+                        </a:ext>
+                      </a:extLst>
+                    </a:blip>
+                    <a:stretch>
+                      <a:fillRect/>
+                    </a:stretch>
+                  </pic:blipFill>
+                  <pic:spPr>
+                    <a:xfrm>
+                      <a:off x="0" y="0"/>
+                      <a:ext cx="5612130" cy="5660390"/>
+                    </a:xfrm>
+                    <a:prstGeom prst="rect">
+                      <a:avLst/>
+                    </a:prstGeom>
+                  </pic:spPr>
+                </pic:pic>
+              </a:graphicData>
+            </a:graphic>
+          </wp:anchor>
+        </w:drawing>
+      </w:r>
+      <w:r>
+        <w:br w:type="textWrapping" w:clear="all"/>
+      </w:r>
+    </w:p>
+    <w:p/>
+    <w:p/>
+    <w:p>
+      <w:proofErr w:type="spellStart"/>
+      <w:r>
+        <w:lastRenderedPageBreak/>
+        <w:t>MovimientoRequestDTO</w:t>
+      </w:r>
+      <w:proofErr w:type="spellEnd"/>
+    </w:p>
+    <w:p>
+      <w:r>
+        <w:drawing>
+          <wp:inline distT="0" distB="0" distL="0" distR="0" wp14:anchorId="07E68365" wp14:editId="5E141026">
+            <wp:extent cx="5612130" cy="4588510"/>
+            <wp:effectExtent l="0" t="0" r="7620" b="2540"/>
+            <wp:docPr id="26" name="Imagen 26"/>
+            <wp:cNvGraphicFramePr>
+              <a:graphicFrameLocks xmlns:a="http://schemas.openxmlformats.org/drawingml/2006/main" noChangeAspect="1"/>
+            </wp:cNvGraphicFramePr>
+            <a:graphic xmlns:a="http://schemas.openxmlformats.org/drawingml/2006/main">
+              <a:graphicData uri="http://schemas.openxmlformats.org/drawingml/2006/picture">
+                <pic:pic xmlns:pic="http://schemas.openxmlformats.org/drawingml/2006/picture">
+                  <pic:nvPicPr>
+                    <pic:cNvPr id="1" name=""/>
+                    <pic:cNvPicPr/>
+                  </pic:nvPicPr>
+                  <pic:blipFill>
+                    <a:blip r:embed="rId37"/>
+                    <a:stretch>
+                      <a:fillRect/>
+                    </a:stretch>
+                  </pic:blipFill>
+                  <pic:spPr>
+                    <a:xfrm>
+                      <a:off x="0" y="0"/>
+                      <a:ext cx="5612130" cy="4588510"/>
+                    </a:xfrm>
+                    <a:prstGeom prst="rect">
+                      <a:avLst/>
+                    </a:prstGeom>
+                  </pic:spPr>
+                </pic:pic>
+              </a:graphicData>
+            </a:graphic>
+          </wp:inline>
+        </w:drawing>
+      </w:r>
+    </w:p>
+    <w:p/>
+    <w:p/>
+    <w:p/>
+    <w:p/>
+    <w:p/>
+    <w:p/>
+    <w:p/>
+    <w:p/>
+    <w:p/>
+    <w:p/>
+    <w:p/>
+    <w:p>
+      <w:proofErr w:type="spellStart"/>
+      <w:r>
+        <w:lastRenderedPageBreak/>
+        <w:t>MovimientoResponseDTO</w:t>
+      </w:r>
+      <w:proofErr w:type="spellEnd"/>
+    </w:p>
+    <w:p>
+      <w:r>
+        <w:drawing>
+          <wp:inline distT="0" distB="0" distL="0" distR="0" wp14:anchorId="2B20554E" wp14:editId="1275669C">
+            <wp:extent cx="4315427" cy="3810532"/>
+            <wp:effectExtent l="0" t="0" r="9525" b="0"/>
+            <wp:docPr id="27" name="Imagen 27"/>
+            <wp:cNvGraphicFramePr>
+              <a:graphicFrameLocks xmlns:a="http://schemas.openxmlformats.org/drawingml/2006/main" noChangeAspect="1"/>
+            </wp:cNvGraphicFramePr>
+            <a:graphic xmlns:a="http://schemas.openxmlformats.org/drawingml/2006/main">
+              <a:graphicData uri="http://schemas.openxmlformats.org/drawingml/2006/picture">
+                <pic:pic xmlns:pic="http://schemas.openxmlformats.org/drawingml/2006/picture">
+                  <pic:nvPicPr>
+                    <pic:cNvPr id="1" name=""/>
+                    <pic:cNvPicPr/>
+                  </pic:nvPicPr>
+                  <pic:blipFill>
+                    <a:blip r:embed="rId38"/>
+                    <a:stretch>
+                      <a:fillRect/>
+                    </a:stretch>
+                  </pic:blipFill>
+                  <pic:spPr>
+                    <a:xfrm>
+                      <a:off x="0" y="0"/>
+                      <a:ext cx="4315427" cy="3810532"/>
+                    </a:xfrm>
+                    <a:prstGeom prst="rect">
+                      <a:avLst/>
+                    </a:prstGeom>
+                  </pic:spPr>
+                </pic:pic>
+              </a:graphicData>
+            </a:graphic>
+          </wp:inline>
+        </w:drawing>
+      </w:r>
+    </w:p>
+    <w:p/>
+    <w:p/>
+    <w:p>
+      <w:pPr>
+        <w:pStyle w:val="Ttulo2"/>
+      </w:pPr>
+      <w:r>
+        <w:t>Los Repositorios</w:t>
+      </w:r>
+    </w:p>
+    <w:p>
+      <w:r>
+        <w:t xml:space="preserve">Se actualizo </w:t>
+      </w:r>
+      <w:proofErr w:type="spellStart"/>
+      <w:r>
+        <w:t>MedicamentoRepository</w:t>
+      </w:r>
+      <w:proofErr w:type="spellEnd"/>
+      <w:r>
+        <w:t xml:space="preserve"> agregando filtros.</w:t>
+      </w:r>
+    </w:p>
+    <w:p>
+      <w:r>
+        <w:drawing>
+          <wp:inline distT="0" distB="0" distL="0" distR="0" wp14:anchorId="08D1C834" wp14:editId="0B51BBF5">
+            <wp:extent cx="5612130" cy="2875915"/>
+            <wp:effectExtent l="0" t="0" r="7620" b="635"/>
+            <wp:docPr id="29" name="Imagen 29"/>
+            <wp:cNvGraphicFramePr>
+              <a:graphicFrameLocks xmlns:a="http://schemas.openxmlformats.org/drawingml/2006/main" noChangeAspect="1"/>
+            </wp:cNvGraphicFramePr>
+            <a:graphic xmlns:a="http://schemas.openxmlformats.org/drawingml/2006/main">
+              <a:graphicData uri="http://schemas.openxmlformats.org/drawingml/2006/picture">
+                <pic:pic xmlns:pic="http://schemas.openxmlformats.org/drawingml/2006/picture">
+                  <pic:nvPicPr>
+                    <pic:cNvPr id="1" name=""/>
+                    <pic:cNvPicPr/>
+                  </pic:nvPicPr>
+                  <pic:blipFill>
+                    <a:blip r:embed="rId39"/>
+                    <a:stretch>
+                      <a:fillRect/>
+                    </a:stretch>
+                  </pic:blipFill>
+                  <pic:spPr>
+                    <a:xfrm>
+                      <a:off x="0" y="0"/>
+                      <a:ext cx="5612130" cy="2875915"/>
+                    </a:xfrm>
+                    <a:prstGeom prst="rect">
+                      <a:avLst/>
+                    </a:prstGeom>
+                  </pic:spPr>
+                </pic:pic>
+              </a:graphicData>
+            </a:graphic>
+          </wp:inline>
+        </w:drawing>
+      </w:r>
+    </w:p>
+    <w:p>
+      <w:r>
+        <w:lastRenderedPageBreak/>
+        <w:t xml:space="preserve">Se creo </w:t>
+      </w:r>
+      <w:proofErr w:type="spellStart"/>
+      <w:r>
+        <w:t>MovimientoRepository</w:t>
+      </w:r>
+      <w:proofErr w:type="spellEnd"/>
+    </w:p>
+    <w:p>
+      <w:r>
+        <w:drawing>
+          <wp:inline distT="0" distB="0" distL="0" distR="0" wp14:anchorId="7143ABBB" wp14:editId="38A9AA20">
+            <wp:extent cx="5612130" cy="1790700"/>
+            <wp:effectExtent l="0" t="0" r="7620" b="0"/>
+            <wp:docPr id="30" name="Imagen 30"/>
+            <wp:cNvGraphicFramePr>
+              <a:graphicFrameLocks xmlns:a="http://schemas.openxmlformats.org/drawingml/2006/main" noChangeAspect="1"/>
+            </wp:cNvGraphicFramePr>
+            <a:graphic xmlns:a="http://schemas.openxmlformats.org/drawingml/2006/main">
+              <a:graphicData uri="http://schemas.openxmlformats.org/drawingml/2006/picture">
+                <pic:pic xmlns:pic="http://schemas.openxmlformats.org/drawingml/2006/picture">
+                  <pic:nvPicPr>
+                    <pic:cNvPr id="1" name=""/>
+                    <pic:cNvPicPr/>
+                  </pic:nvPicPr>
+                  <pic:blipFill>
+                    <a:blip r:embed="rId40"/>
+                    <a:stretch>
+                      <a:fillRect/>
+                    </a:stretch>
+                  </pic:blipFill>
+                  <pic:spPr>
+                    <a:xfrm>
+                      <a:off x="0" y="0"/>
+                      <a:ext cx="5612130" cy="1790700"/>
+                    </a:xfrm>
+                    <a:prstGeom prst="rect">
+                      <a:avLst/>
+                    </a:prstGeom>
+                  </pic:spPr>
+                </pic:pic>
+              </a:graphicData>
+            </a:graphic>
+          </wp:inline>
+        </w:drawing>
+      </w:r>
+    </w:p>
+    <w:p/>
+    <w:p>
+      <w:pPr>
+        <w:pStyle w:val="Ttulo2"/>
+      </w:pPr>
+      <w:r>
+        <w:t>Manejo de Excepciones</w:t>
+      </w:r>
+    </w:p>
+    <w:p>
+      <w:r>
+        <w:drawing>
+          <wp:inline distT="0" distB="0" distL="0" distR="0" wp14:anchorId="5033B1A8" wp14:editId="6A334F72">
+            <wp:extent cx="2715004" cy="990738"/>
+            <wp:effectExtent l="0" t="0" r="9525" b="0"/>
+            <wp:docPr id="31" name="Imagen 31"/>
+            <wp:cNvGraphicFramePr>
+              <a:graphicFrameLocks xmlns:a="http://schemas.openxmlformats.org/drawingml/2006/main" noChangeAspect="1"/>
+            </wp:cNvGraphicFramePr>
+            <a:graphic xmlns:a="http://schemas.openxmlformats.org/drawingml/2006/main">
+              <a:graphicData uri="http://schemas.openxmlformats.org/drawingml/2006/picture">
+                <pic:pic xmlns:pic="http://schemas.openxmlformats.org/drawingml/2006/picture">
+                  <pic:nvPicPr>
+                    <pic:cNvPr id="1" name=""/>
+                    <pic:cNvPicPr/>
+                  </pic:nvPicPr>
+                  <pic:blipFill>
+                    <a:blip r:embed="rId41"/>
+                    <a:stretch>
+                      <a:fillRect/>
+                    </a:stretch>
+                  </pic:blipFill>
+                  <pic:spPr>
+                    <a:xfrm>
+                      <a:off x="0" y="0"/>
+                      <a:ext cx="2715004" cy="990738"/>
+                    </a:xfrm>
+                    <a:prstGeom prst="rect">
+                      <a:avLst/>
+                    </a:prstGeom>
+                  </pic:spPr>
+                </pic:pic>
+              </a:graphicData>
+            </a:graphic>
+          </wp:inline>
+        </w:drawing>
+      </w:r>
+    </w:p>
+    <w:p>
+      <w:proofErr w:type="spellStart"/>
+      <w:r>
+        <w:t>ResourceNotFoundException</w:t>
+      </w:r>
+      <w:proofErr w:type="spellEnd"/>
+      <w:r>
+        <w:t xml:space="preserve"> cuando algo no existe</w:t>
+      </w:r>
+    </w:p>
+    <w:p>
+      <w:r>
+        <w:drawing>
+          <wp:inline distT="0" distB="0" distL="0" distR="0" wp14:anchorId="26BD1B9C" wp14:editId="44E4A5F6">
+            <wp:extent cx="5612130" cy="1449070"/>
+            <wp:effectExtent l="0" t="0" r="7620" b="0"/>
+            <wp:docPr id="32" name="Imagen 32"/>
+            <wp:cNvGraphicFramePr>
+              <a:graphicFrameLocks xmlns:a="http://schemas.openxmlformats.org/drawingml/2006/main" noChangeAspect="1"/>
+            </wp:cNvGraphicFramePr>
+            <a:graphic xmlns:a="http://schemas.openxmlformats.org/drawingml/2006/main">
+              <a:graphicData uri="http://schemas.openxmlformats.org/drawingml/2006/picture">
+                <pic:pic xmlns:pic="http://schemas.openxmlformats.org/drawingml/2006/picture">
+                  <pic:nvPicPr>
+                    <pic:cNvPr id="1" name=""/>
+                    <pic:cNvPicPr/>
+                  </pic:nvPicPr>
+                  <pic:blipFill>
+                    <a:blip r:embed="rId42"/>
+                    <a:stretch>
+                      <a:fillRect/>
+                    </a:stretch>
+                  </pic:blipFill>
+                  <pic:spPr>
+                    <a:xfrm>
+                      <a:off x="0" y="0"/>
+                      <a:ext cx="5612130" cy="1449070"/>
+                    </a:xfrm>
+                    <a:prstGeom prst="rect">
+                      <a:avLst/>
+                    </a:prstGeom>
+                  </pic:spPr>
+                </pic:pic>
+              </a:graphicData>
+            </a:graphic>
+          </wp:inline>
+        </w:drawing>
+      </w:r>
+    </w:p>
+    <w:p>
+      <w:proofErr w:type="spellStart"/>
+      <w:r>
+        <w:t>BusinessException</w:t>
+      </w:r>
+      <w:proofErr w:type="spellEnd"/>
+    </w:p>
+    <w:p>
+      <w:r>
+        <w:t>Para reglas de negocio cuando el stock es insuficiente</w:t>
+      </w:r>
+    </w:p>
+    <w:p>
+      <w:r>
+        <w:drawing>
+          <wp:inline distT="0" distB="0" distL="0" distR="0" wp14:anchorId="27F07860" wp14:editId="3F4E0D63">
+            <wp:extent cx="5612130" cy="1625600"/>
+            <wp:effectExtent l="0" t="0" r="7620" b="0"/>
+            <wp:docPr id="33" name="Imagen 33"/>
+            <wp:cNvGraphicFramePr>
+              <a:graphicFrameLocks xmlns:a="http://schemas.openxmlformats.org/drawingml/2006/main" noChangeAspect="1"/>
+            </wp:cNvGraphicFramePr>
+            <a:graphic xmlns:a="http://schemas.openxmlformats.org/drawingml/2006/main">
+              <a:graphicData uri="http://schemas.openxmlformats.org/drawingml/2006/picture">
+                <pic:pic xmlns:pic="http://schemas.openxmlformats.org/drawingml/2006/picture">
+                  <pic:nvPicPr>
+                    <pic:cNvPr id="1" name=""/>
+                    <pic:cNvPicPr/>
+                  </pic:nvPicPr>
+                  <pic:blipFill>
+                    <a:blip r:embed="rId43"/>
+                    <a:stretch>
+                      <a:fillRect/>
+                    </a:stretch>
+                  </pic:blipFill>
+                  <pic:spPr>
+                    <a:xfrm>
+                      <a:off x="0" y="0"/>
+                      <a:ext cx="5612130" cy="1625600"/>
+                    </a:xfrm>
+                    <a:prstGeom prst="rect">
+                      <a:avLst/>
+                    </a:prstGeom>
+                  </pic:spPr>
+                </pic:pic>
+              </a:graphicData>
+            </a:graphic>
+          </wp:inline>
+        </w:drawing>
+      </w:r>
+    </w:p>
+    <w:p/>
+    <w:p>
+      <w:proofErr w:type="spellStart"/>
+      <w:r>
+        <w:lastRenderedPageBreak/>
+        <w:t>GlobalExceptionHandler</w:t>
+      </w:r>
+      <w:proofErr w:type="spellEnd"/>
+      <w:r>
+        <w:t xml:space="preserve"> aquí se atrapan todos los errores</w:t>
+      </w:r>
+    </w:p>
+    <w:p>
+      <w:pPr>
+        <w:rPr>
+          <w:noProof/>
+        </w:rPr>
+      </w:pPr>
+      <w:r>
+        <w:drawing>
+          <wp:inline distT="0" distB="0" distL="0" distR="0" wp14:anchorId="53469877" wp14:editId="1DA23361">
+            <wp:extent cx="5612130" cy="4526280"/>
+            <wp:effectExtent l="0" t="0" r="7620" b="7620"/>
+            <wp:docPr id="34" name="Imagen 34"/>
+            <wp:cNvGraphicFramePr>
+              <a:graphicFrameLocks xmlns:a="http://schemas.openxmlformats.org/drawingml/2006/main" noChangeAspect="1"/>
+            </wp:cNvGraphicFramePr>
+            <a:graphic xmlns:a="http://schemas.openxmlformats.org/drawingml/2006/main">
+              <a:graphicData uri="http://schemas.openxmlformats.org/drawingml/2006/picture">
+                <pic:pic xmlns:pic="http://schemas.openxmlformats.org/drawingml/2006/picture">
+                  <pic:nvPicPr>
+                    <pic:cNvPr id="1" name=""/>
+                    <pic:cNvPicPr/>
+                  </pic:nvPicPr>
+                  <pic:blipFill>
+                    <a:blip r:embed="rId44"/>
+                    <a:stretch>
+                      <a:fillRect/>
+                    </a:stretch>
+                  </pic:blipFill>
+                  <pic:spPr>
+                    <a:xfrm>
+                      <a:off x="0" y="0"/>
+                      <a:ext cx="5612130" cy="4526280"/>
+                    </a:xfrm>
+                    <a:prstGeom prst="rect">
+                      <a:avLst/>
+                    </a:prstGeom>
+                  </pic:spPr>
+                </pic:pic>
+              </a:graphicData>
+            </a:graphic>
+          </wp:inline>
+        </w:drawing>
+      </w:r>
+      <w:r>
+        <w:rPr>
+          <w:noProof/>
+        </w:rPr>
+        <w:t xml:space="preserve"> </w:t>
+      </w:r>
+      <w:r>
+        <w:drawing>
+          <wp:inline distT="0" distB="0" distL="0" distR="0" wp14:anchorId="5E27D367" wp14:editId="1CDD16C6">
+            <wp:extent cx="5612130" cy="2291080"/>
+            <wp:effectExtent l="0" t="0" r="7620" b="0"/>
+            <wp:docPr id="35" name="Imagen 35"/>
+            <wp:cNvGraphicFramePr>
+              <a:graphicFrameLocks xmlns:a="http://schemas.openxmlformats.org/drawingml/2006/main" noChangeAspect="1"/>
+            </wp:cNvGraphicFramePr>
+            <a:graphic xmlns:a="http://schemas.openxmlformats.org/drawingml/2006/main">
+              <a:graphicData uri="http://schemas.openxmlformats.org/drawingml/2006/picture">
+                <pic:pic xmlns:pic="http://schemas.openxmlformats.org/drawingml/2006/picture">
+                  <pic:nvPicPr>
+                    <pic:cNvPr id="1" name=""/>
+                    <pic:cNvPicPr/>
+                  </pic:nvPicPr>
+                  <pic:blipFill>
+                    <a:blip r:embed="rId45"/>
+                    <a:stretch>
+                      <a:fillRect/>
+                    </a:stretch>
+                  </pic:blipFill>
+                  <pic:spPr>
+                    <a:xfrm>
+                      <a:off x="0" y="0"/>
+                      <a:ext cx="5612130" cy="2291080"/>
+                    </a:xfrm>
+                    <a:prstGeom prst="rect">
+                      <a:avLst/>
+                    </a:prstGeom>
+                  </pic:spPr>
+                </pic:pic>
+              </a:graphicData>
+            </a:graphic>
+          </wp:inline>
+        </w:drawing>
+      </w:r>
+    </w:p>
+    <w:p>
+      <w:pPr>
+        <w:rPr>
+          <w:noProof/>
+        </w:rPr>
+      </w:pPr>
+    </w:p>
+    <w:p>
+      <w:pPr>
+        <w:rPr>
+          <w:noProof/>
+        </w:rPr>
+      </w:pPr>
+    </w:p>
+    <w:p>
+      <w:pPr>
+        <w:rPr>
+          <w:noProof/>
+        </w:rPr>
+      </w:pPr>
+    </w:p>
+    <w:p>
+      <w:pPr>
+        <w:pStyle w:val="Ttulo2"/>
+      </w:pPr>
+      <w:r>
+        <w:lastRenderedPageBreak/>
+        <w:t>Los Servicios</w:t>
+      </w:r>
+    </w:p>
+    <w:p>
+      <w:r>
+        <w:drawing>
+          <wp:inline distT="0" distB="0" distL="0" distR="0" wp14:anchorId="14872A6D" wp14:editId="2073629A">
+            <wp:extent cx="2276793" cy="714475"/>
+            <wp:effectExtent l="0" t="0" r="0" b="9525"/>
+            <wp:docPr id="42" name="Imagen 42"/>
+            <wp:cNvGraphicFramePr>
+              <a:graphicFrameLocks xmlns:a="http://schemas.openxmlformats.org/drawingml/2006/main" noChangeAspect="1"/>
+            </wp:cNvGraphicFramePr>
+            <a:graphic xmlns:a="http://schemas.openxmlformats.org/drawingml/2006/main">
+              <a:graphicData uri="http://schemas.openxmlformats.org/drawingml/2006/picture">
+                <pic:pic xmlns:pic="http://schemas.openxmlformats.org/drawingml/2006/picture">
+                  <pic:nvPicPr>
+                    <pic:cNvPr id="1" name=""/>
+                    <pic:cNvPicPr/>
+                  </pic:nvPicPr>
+                  <pic:blipFill>
+                    <a:blip r:embed="rId46"/>
+                    <a:stretch>
+                      <a:fillRect/>
+                    </a:stretch>
+                  </pic:blipFill>
+                  <pic:spPr>
+                    <a:xfrm>
+                      <a:off x="0" y="0"/>
+                      <a:ext cx="2276793" cy="714475"/>
+                    </a:xfrm>
+                    <a:prstGeom prst="rect">
+                      <a:avLst/>
+                    </a:prstGeom>
+                  </pic:spPr>
+                </pic:pic>
+              </a:graphicData>
+            </a:graphic>
+          </wp:inline>
+        </w:drawing>
+      </w:r>
+    </w:p>
+    <w:p>
+      <w:r>
+        <w:t xml:space="preserve">Se actualizo </w:t>
+      </w:r>
+      <w:proofErr w:type="spellStart"/>
+      <w:r>
+        <w:t>MedicamentoService</w:t>
+      </w:r>
+      <w:proofErr w:type="spellEnd"/>
+    </w:p>
+    <w:p>
+      <w:pPr>
+        <w:rPr>
+          <w:noProof/>
+        </w:rPr>
+      </w:pPr>
+      <w:r>
+        <w:drawing>
+          <wp:inline distT="0" distB="0" distL="0" distR="0" wp14:anchorId="27178EA3" wp14:editId="41FADBA3">
+            <wp:extent cx="5612130" cy="3671570"/>
+            <wp:effectExtent l="0" t="0" r="7620" b="5080"/>
+            <wp:docPr id="36" name="Imagen 36"/>
+            <wp:cNvGraphicFramePr>
+              <a:graphicFrameLocks xmlns:a="http://schemas.openxmlformats.org/drawingml/2006/main" noChangeAspect="1"/>
+            </wp:cNvGraphicFramePr>
+            <a:graphic xmlns:a="http://schemas.openxmlformats.org/drawingml/2006/main">
+              <a:graphicData uri="http://schemas.openxmlformats.org/drawingml/2006/picture">
+                <pic:pic xmlns:pic="http://schemas.openxmlformats.org/drawingml/2006/picture">
+                  <pic:nvPicPr>
+                    <pic:cNvPr id="1" name=""/>
+                    <pic:cNvPicPr/>
+                  </pic:nvPicPr>
+                  <pic:blipFill>
+                    <a:blip r:embed="rId47"/>
+                    <a:stretch>
+                      <a:fillRect/>
+                    </a:stretch>
+                  </pic:blipFill>
+                  <pic:spPr>
+                    <a:xfrm>
+                      <a:off x="0" y="0"/>
+                      <a:ext cx="5612130" cy="3671570"/>
+                    </a:xfrm>
+                    <a:prstGeom prst="rect">
+                      <a:avLst/>
+                    </a:prstGeom>
+                  </pic:spPr>
+                </pic:pic>
+              </a:graphicData>
+            </a:graphic>
+          </wp:inline>
+        </w:drawing>
+      </w:r>
+    </w:p>
+    <w:p>
+      <w:pPr>
+        <w:rPr>
+          <w:noProof/>
+        </w:rPr>
+      </w:pPr>
+      <w:r>
+        <w:lastRenderedPageBreak/>
+        <w:drawing>
+          <wp:inline distT="0" distB="0" distL="0" distR="0" wp14:anchorId="62534F9D" wp14:editId="704F67F8">
+            <wp:extent cx="5612130" cy="3639185"/>
+            <wp:effectExtent l="0" t="0" r="7620" b="0"/>
+            <wp:docPr id="37" name="Imagen 37"/>
+            <wp:cNvGraphicFramePr>
+              <a:graphicFrameLocks xmlns:a="http://schemas.openxmlformats.org/drawingml/2006/main" noChangeAspect="1"/>
+            </wp:cNvGraphicFramePr>
+            <a:graphic xmlns:a="http://schemas.openxmlformats.org/drawingml/2006/main">
+              <a:graphicData uri="http://schemas.openxmlformats.org/drawingml/2006/picture">
+                <pic:pic xmlns:pic="http://schemas.openxmlformats.org/drawingml/2006/picture">
+                  <pic:nvPicPr>
+                    <pic:cNvPr id="1" name=""/>
+                    <pic:cNvPicPr/>
+                  </pic:nvPicPr>
+                  <pic:blipFill>
+                    <a:blip r:embed="rId48"/>
+                    <a:stretch>
+                      <a:fillRect/>
+                    </a:stretch>
+                  </pic:blipFill>
+                  <pic:spPr>
+                    <a:xfrm>
+                      <a:off x="0" y="0"/>
+                      <a:ext cx="5612130" cy="3639185"/>
+                    </a:xfrm>
+                    <a:prstGeom prst="rect">
+                      <a:avLst/>
+                    </a:prstGeom>
+                  </pic:spPr>
+                </pic:pic>
+              </a:graphicData>
+            </a:graphic>
+          </wp:inline>
+        </w:drawing>
+      </w:r>
+      <w:r>
+        <w:rPr>
+          <w:noProof/>
+        </w:rPr>
+        <w:t xml:space="preserve"> </w:t>
+      </w:r>
+    </w:p>
+    <w:p>
+      <w:r>
+        <w:drawing>
+          <wp:inline distT="0" distB="0" distL="0" distR="0" wp14:anchorId="0F1A6297" wp14:editId="5028FBCF">
+            <wp:extent cx="5612130" cy="2322830"/>
+            <wp:effectExtent l="0" t="0" r="7620" b="1270"/>
+            <wp:docPr id="38" name="Imagen 38"/>
+            <wp:cNvGraphicFramePr>
+              <a:graphicFrameLocks xmlns:a="http://schemas.openxmlformats.org/drawingml/2006/main" noChangeAspect="1"/>
+            </wp:cNvGraphicFramePr>
+            <a:graphic xmlns:a="http://schemas.openxmlformats.org/drawingml/2006/main">
+              <a:graphicData uri="http://schemas.openxmlformats.org/drawingml/2006/picture">
+                <pic:pic xmlns:pic="http://schemas.openxmlformats.org/drawingml/2006/picture">
+                  <pic:nvPicPr>
+                    <pic:cNvPr id="1" name=""/>
+                    <pic:cNvPicPr/>
+                  </pic:nvPicPr>
+                  <pic:blipFill>
+                    <a:blip r:embed="rId49"/>
+                    <a:stretch>
+                      <a:fillRect/>
+                    </a:stretch>
+                  </pic:blipFill>
+                  <pic:spPr>
+                    <a:xfrm>
+                      <a:off x="0" y="0"/>
+                      <a:ext cx="5612130" cy="2322830"/>
+                    </a:xfrm>
+                    <a:prstGeom prst="rect">
+                      <a:avLst/>
+                    </a:prstGeom>
+                  </pic:spPr>
+                </pic:pic>
+              </a:graphicData>
+            </a:graphic>
+          </wp:inline>
+        </w:drawing>
+      </w:r>
+    </w:p>
+    <w:p/>
+    <w:p/>
+    <w:p/>
+    <w:p/>
+    <w:p/>
+    <w:p/>
+    <w:p/>
+    <w:p>
+      <w:proofErr w:type="spellStart"/>
+      <w:r>
+        <w:lastRenderedPageBreak/>
+        <w:t>MovimientoService</w:t>
+      </w:r>
+      <w:proofErr w:type="spellEnd"/>
+    </w:p>
+    <w:p>
+      <w:pPr>
+        <w:rPr>
+          <w:noProof/>
+        </w:rPr>
+      </w:pPr>
+      <w:r>
+        <w:drawing>
+          <wp:inline distT="0" distB="0" distL="0" distR="0" wp14:anchorId="7EC11D4C" wp14:editId="20E62D39">
+            <wp:extent cx="5612130" cy="3384550"/>
+            <wp:effectExtent l="0" t="0" r="7620" b="6350"/>
+            <wp:docPr id="39" name="Imagen 39"/>
+            <wp:cNvGraphicFramePr>
+              <a:graphicFrameLocks xmlns:a="http://schemas.openxmlformats.org/drawingml/2006/main" noChangeAspect="1"/>
+            </wp:cNvGraphicFramePr>
+            <a:graphic xmlns:a="http://schemas.openxmlformats.org/drawingml/2006/main">
+              <a:graphicData uri="http://schemas.openxmlformats.org/drawingml/2006/picture">
+                <pic:pic xmlns:pic="http://schemas.openxmlformats.org/drawingml/2006/picture">
+                  <pic:nvPicPr>
+                    <pic:cNvPr id="1" name=""/>
+                    <pic:cNvPicPr/>
+                  </pic:nvPicPr>
+                  <pic:blipFill>
+                    <a:blip r:embed="rId50"/>
+                    <a:stretch>
+                      <a:fillRect/>
+                    </a:stretch>
+                  </pic:blipFill>
+                  <pic:spPr>
+                    <a:xfrm>
+                      <a:off x="0" y="0"/>
+                      <a:ext cx="5612130" cy="3384550"/>
+                    </a:xfrm>
+                    <a:prstGeom prst="rect">
+                      <a:avLst/>
+                    </a:prstGeom>
+                  </pic:spPr>
+                </pic:pic>
+              </a:graphicData>
+            </a:graphic>
+          </wp:inline>
+        </w:drawing>
+      </w:r>
+      <w:r>
+        <w:rPr>
+          <w:noProof/>
+        </w:rPr>
+        <w:t xml:space="preserve"> </w:t>
+      </w:r>
+      <w:r>
+        <w:drawing>
+          <wp:inline distT="0" distB="0" distL="0" distR="0" wp14:anchorId="284FBB26" wp14:editId="65896C35">
+            <wp:extent cx="5612130" cy="2962275"/>
+            <wp:effectExtent l="0" t="0" r="7620" b="9525"/>
+            <wp:docPr id="40" name="Imagen 40"/>
+            <wp:cNvGraphicFramePr>
+              <a:graphicFrameLocks xmlns:a="http://schemas.openxmlformats.org/drawingml/2006/main" noChangeAspect="1"/>
+            </wp:cNvGraphicFramePr>
+            <a:graphic xmlns:a="http://schemas.openxmlformats.org/drawingml/2006/main">
+              <a:graphicData uri="http://schemas.openxmlformats.org/drawingml/2006/picture">
+                <pic:pic xmlns:pic="http://schemas.openxmlformats.org/drawingml/2006/picture">
+                  <pic:nvPicPr>
+                    <pic:cNvPr id="1" name=""/>
+                    <pic:cNvPicPr/>
+                  </pic:nvPicPr>
+                  <pic:blipFill>
+                    <a:blip r:embed="rId51"/>
+                    <a:stretch>
+                      <a:fillRect/>
+                    </a:stretch>
+                  </pic:blipFill>
+                  <pic:spPr>
+                    <a:xfrm>
+                      <a:off x="0" y="0"/>
+                      <a:ext cx="5612130" cy="2962275"/>
+                    </a:xfrm>
+                    <a:prstGeom prst="rect">
+                      <a:avLst/>
+                    </a:prstGeom>
+                  </pic:spPr>
+                </pic:pic>
+              </a:graphicData>
+            </a:graphic>
+          </wp:inline>
+        </w:drawing>
+      </w:r>
+    </w:p>
+    <w:p>
+      <w:r>
+        <w:lastRenderedPageBreak/>
+        <w:drawing>
+          <wp:inline distT="0" distB="0" distL="0" distR="0" wp14:anchorId="6D332B74" wp14:editId="5C5011B6">
+            <wp:extent cx="5612130" cy="3176905"/>
+            <wp:effectExtent l="0" t="0" r="7620" b="4445"/>
+            <wp:docPr id="41" name="Imagen 41"/>
+            <wp:cNvGraphicFramePr>
+              <a:graphicFrameLocks xmlns:a="http://schemas.openxmlformats.org/drawingml/2006/main" noChangeAspect="1"/>
+            </wp:cNvGraphicFramePr>
+            <a:graphic xmlns:a="http://schemas.openxmlformats.org/drawingml/2006/main">
+              <a:graphicData uri="http://schemas.openxmlformats.org/drawingml/2006/picture">
+                <pic:pic xmlns:pic="http://schemas.openxmlformats.org/drawingml/2006/picture">
+                  <pic:nvPicPr>
+                    <pic:cNvPr id="1" name=""/>
+                    <pic:cNvPicPr/>
+                  </pic:nvPicPr>
+                  <pic:blipFill>
+                    <a:blip r:embed="rId52"/>
+                    <a:stretch>
+                      <a:fillRect/>
+                    </a:stretch>
+                  </pic:blipFill>
+                  <pic:spPr>
+                    <a:xfrm>
+                      <a:off x="0" y="0"/>
+                      <a:ext cx="5612130" cy="3176905"/>
+                    </a:xfrm>
+                    <a:prstGeom prst="rect">
+                      <a:avLst/>
+                    </a:prstGeom>
+                  </pic:spPr>
+                </pic:pic>
+              </a:graphicData>
+            </a:graphic>
+          </wp:inline>
+        </w:drawing>
+      </w:r>
+    </w:p>
+    <w:p>
+      <w:pPr>
+        <w:pStyle w:val="Ttulo2"/>
+      </w:pPr>
+      <w:r>
+        <w:t>Controladores</w:t>
+      </w:r>
+    </w:p>
+    <w:p>
+      <w:proofErr w:type="spellStart"/>
+      <w:r>
+        <w:t>MedicamentoController</w:t>
+      </w:r>
+      <w:proofErr w:type="spellEnd"/>
+      <w:r>
+        <w:t xml:space="preserve"> se actualizo este </w:t>
+      </w:r>
+      <w:proofErr w:type="spellStart"/>
+      <w:r>
+        <w:t>controller</w:t>
+      </w:r>
+      <w:proofErr w:type="spellEnd"/>
+    </w:p>
+    <w:p>
+      <w:r>
+        <w:drawing>
+          <wp:inline distT="0" distB="0" distL="0" distR="0" wp14:anchorId="4E969A73" wp14:editId="4F7093A8">
+            <wp:extent cx="5612130" cy="3672205"/>
+            <wp:effectExtent l="0" t="0" r="7620" b="4445"/>
+            <wp:docPr id="43" name="Imagen 43"/>
+            <wp:cNvGraphicFramePr>
+              <a:graphicFrameLocks xmlns:a="http://schemas.openxmlformats.org/drawingml/2006/main" noChangeAspect="1"/>
+            </wp:cNvGraphicFramePr>
+            <a:graphic xmlns:a="http://schemas.openxmlformats.org/drawingml/2006/main">
+              <a:graphicData uri="http://schemas.openxmlformats.org/drawingml/2006/picture">
+                <pic:pic xmlns:pic="http://schemas.openxmlformats.org/drawingml/2006/picture">
+                  <pic:nvPicPr>
+                    <pic:cNvPr id="1" name=""/>
+                    <pic:cNvPicPr/>
+                  </pic:nvPicPr>
+                  <pic:blipFill>
+                    <a:blip r:embed="rId53"/>
+                    <a:stretch>
+                      <a:fillRect/>
+                    </a:stretch>
+                  </pic:blipFill>
+                  <pic:spPr>
+                    <a:xfrm>
+                      <a:off x="0" y="0"/>
+                      <a:ext cx="5612130" cy="3672205"/>
+                    </a:xfrm>
+                    <a:prstGeom prst="rect">
+                      <a:avLst/>
+                    </a:prstGeom>
+                  </pic:spPr>
+                </pic:pic>
+              </a:graphicData>
+            </a:graphic>
+          </wp:inline>
+        </w:drawing>
+      </w:r>
+    </w:p>
+    <w:p>
+      <w:r>
+        <w:lastRenderedPageBreak/>
+        <w:drawing>
+          <wp:inline distT="0" distB="0" distL="0" distR="0" wp14:anchorId="3EFA1276" wp14:editId="46D7D31C">
+            <wp:extent cx="5612130" cy="2672715"/>
+            <wp:effectExtent l="0" t="0" r="7620" b="0"/>
+            <wp:docPr id="44" name="Imagen 44"/>
+            <wp:cNvGraphicFramePr>
+              <a:graphicFrameLocks xmlns:a="http://schemas.openxmlformats.org/drawingml/2006/main" noChangeAspect="1"/>
+            </wp:cNvGraphicFramePr>
+            <a:graphic xmlns:a="http://schemas.openxmlformats.org/drawingml/2006/main">
+              <a:graphicData uri="http://schemas.openxmlformats.org/drawingml/2006/picture">
+                <pic:pic xmlns:pic="http://schemas.openxmlformats.org/drawingml/2006/picture">
+                  <pic:nvPicPr>
+                    <pic:cNvPr id="1" name=""/>
+                    <pic:cNvPicPr/>
+                  </pic:nvPicPr>
+                  <pic:blipFill>
+                    <a:blip r:embed="rId54"/>
+                    <a:stretch>
+                      <a:fillRect/>
+                    </a:stretch>
+                  </pic:blipFill>
+                  <pic:spPr>
+                    <a:xfrm>
+                      <a:off x="0" y="0"/>
+                      <a:ext cx="5612130" cy="2672715"/>
+                    </a:xfrm>
+                    <a:prstGeom prst="rect">
+                      <a:avLst/>
+                    </a:prstGeom>
+                  </pic:spPr>
+                </pic:pic>
+              </a:graphicData>
+            </a:graphic>
+          </wp:inline>
+        </w:drawing>
+      </w:r>
+    </w:p>
+    <w:p>
+      <w:r>
+        <w:t xml:space="preserve">Se creo </w:t>
+      </w:r>
+      <w:proofErr w:type="spellStart"/>
+      <w:r>
+        <w:t>MovimientoController</w:t>
+      </w:r>
+      <w:proofErr w:type="spellEnd"/>
+    </w:p>
+    <w:p>
+      <w:r>
+        <w:drawing>
+          <wp:inline distT="0" distB="0" distL="0" distR="0" wp14:anchorId="1242B9A2" wp14:editId="7965A974">
+            <wp:extent cx="5612130" cy="3630930"/>
+            <wp:effectExtent l="0" t="0" r="7620" b="7620"/>
+            <wp:docPr id="45" name="Imagen 45"/>
+            <wp:cNvGraphicFramePr>
+              <a:graphicFrameLocks xmlns:a="http://schemas.openxmlformats.org/drawingml/2006/main" noChangeAspect="1"/>
+            </wp:cNvGraphicFramePr>
+            <a:graphic xmlns:a="http://schemas.openxmlformats.org/drawingml/2006/main">
+              <a:graphicData uri="http://schemas.openxmlformats.org/drawingml/2006/picture">
+                <pic:pic xmlns:pic="http://schemas.openxmlformats.org/drawingml/2006/picture">
+                  <pic:nvPicPr>
+                    <pic:cNvPr id="1" name=""/>
+                    <pic:cNvPicPr/>
+                  </pic:nvPicPr>
+                  <pic:blipFill>
+                    <a:blip r:embed="rId55"/>
+                    <a:stretch>
+                      <a:fillRect/>
+                    </a:stretch>
+                  </pic:blipFill>
+                  <pic:spPr>
+                    <a:xfrm>
+                      <a:off x="0" y="0"/>
+                      <a:ext cx="5612130" cy="3630930"/>
+                    </a:xfrm>
+                    <a:prstGeom prst="rect">
+                      <a:avLst/>
+                    </a:prstGeom>
+                  </pic:spPr>
+                </pic:pic>
+              </a:graphicData>
+            </a:graphic>
+          </wp:inline>
+        </w:drawing>
+      </w:r>
+    </w:p>
+    <w:p>
+      <w:r>
+        <w:lastRenderedPageBreak/>
+        <w:drawing>
+          <wp:inline distT="0" distB="0" distL="0" distR="0" wp14:anchorId="2777DFFF" wp14:editId="3FB3EB66">
+            <wp:extent cx="5612130" cy="2680335"/>
+            <wp:effectExtent l="0" t="0" r="7620" b="5715"/>
+            <wp:docPr id="46" name="Imagen 46"/>
+            <wp:cNvGraphicFramePr>
+              <a:graphicFrameLocks xmlns:a="http://schemas.openxmlformats.org/drawingml/2006/main" noChangeAspect="1"/>
+            </wp:cNvGraphicFramePr>
+            <a:graphic xmlns:a="http://schemas.openxmlformats.org/drawingml/2006/main">
+              <a:graphicData uri="http://schemas.openxmlformats.org/drawingml/2006/picture">
+                <pic:pic xmlns:pic="http://schemas.openxmlformats.org/drawingml/2006/picture">
+                  <pic:nvPicPr>
+                    <pic:cNvPr id="1" name=""/>
+                    <pic:cNvPicPr/>
+                  </pic:nvPicPr>
+                  <pic:blipFill>
+                    <a:blip r:embed="rId56"/>
+                    <a:stretch>
+                      <a:fillRect/>
+                    </a:stretch>
+                  </pic:blipFill>
+                  <pic:spPr>
+                    <a:xfrm>
+                      <a:off x="0" y="0"/>
+                      <a:ext cx="5612130" cy="2680335"/>
+                    </a:xfrm>
+                    <a:prstGeom prst="rect">
+                      <a:avLst/>
+                    </a:prstGeom>
+                  </pic:spPr>
+                </pic:pic>
+              </a:graphicData>
+            </a:graphic>
+          </wp:inline>
+        </w:drawing>
+      </w:r>
+    </w:p>
+    <w:p>
+      <w:pPr>
+        <w:pStyle w:val="Ttulo2"/>
+      </w:pPr>
+      <w:r>
+        <w:t>Pruebas del avance 2</w:t>
+      </w:r>
+    </w:p>
+    <w:p>
+      <w:r>
+        <w:t>Creación de un medicamento</w:t>
+      </w:r>
+    </w:p>
+    <w:p>
+      <w:r>
+        <w:drawing>
+          <wp:inline distT="0" distB="0" distL="0" distR="0" wp14:anchorId="75B5E082" wp14:editId="0E6A9D91">
+            <wp:extent cx="5612130" cy="4279265"/>
+            <wp:effectExtent l="0" t="0" r="7620" b="6985"/>
+            <wp:docPr id="47" name="Imagen 47"/>
+            <wp:cNvGraphicFramePr>
+              <a:graphicFrameLocks xmlns:a="http://schemas.openxmlformats.org/drawingml/2006/main" noChangeAspect="1"/>
+            </wp:cNvGraphicFramePr>
+            <a:graphic xmlns:a="http://schemas.openxmlformats.org/drawingml/2006/main">
+              <a:graphicData uri="http://schemas.openxmlformats.org/drawingml/2006/picture">
+                <pic:pic xmlns:pic="http://schemas.openxmlformats.org/drawingml/2006/picture">
+                  <pic:nvPicPr>
+                    <pic:cNvPr id="1" name=""/>
+                    <pic:cNvPicPr/>
+                  </pic:nvPicPr>
+                  <pic:blipFill>
+                    <a:blip r:embed="rId57"/>
+                    <a:stretch>
+                      <a:fillRect/>
+                    </a:stretch>
+                  </pic:blipFill>
+                  <pic:spPr>
+                    <a:xfrm>
+                      <a:off x="0" y="0"/>
+                      <a:ext cx="5612130" cy="4279265"/>
+                    </a:xfrm>
+                    <a:prstGeom prst="rect">
+                      <a:avLst/>
+                    </a:prstGeom>
+                  </pic:spPr>
+                </pic:pic>
+              </a:graphicData>
+            </a:graphic>
+          </wp:inline>
+        </w:drawing>
+      </w:r>
+    </w:p>
+    <w:p/>
+    <w:p/>
+    <w:p>
+      <w:r>
+        <w:lastRenderedPageBreak/>
+        <w:t>Registrar una Entrada</w:t>
+      </w:r>
+    </w:p>
+    <w:p>
+      <w:r>
+        <w:drawing>
+          <wp:inline distT="0" distB="0" distL="0" distR="0" wp14:anchorId="1469C7E1" wp14:editId="68572E6A">
+            <wp:extent cx="5612130" cy="4279900"/>
+            <wp:effectExtent l="0" t="0" r="7620" b="6350"/>
+            <wp:docPr id="48" name="Imagen 48"/>
+            <wp:cNvGraphicFramePr>
+              <a:graphicFrameLocks xmlns:a="http://schemas.openxmlformats.org/drawingml/2006/main" noChangeAspect="1"/>
+            </wp:cNvGraphicFramePr>
+            <a:graphic xmlns:a="http://schemas.openxmlformats.org/drawingml/2006/main">
+              <a:graphicData uri="http://schemas.openxmlformats.org/drawingml/2006/picture">
+                <pic:pic xmlns:pic="http://schemas.openxmlformats.org/drawingml/2006/picture">
+                  <pic:nvPicPr>
+                    <pic:cNvPr id="1" name=""/>
+                    <pic:cNvPicPr/>
+                  </pic:nvPicPr>
+                  <pic:blipFill>
+                    <a:blip r:embed="rId58"/>
+                    <a:stretch>
+                      <a:fillRect/>
+                    </a:stretch>
+                  </pic:blipFill>
+                  <pic:spPr>
+                    <a:xfrm>
+                      <a:off x="0" y="0"/>
+                      <a:ext cx="5612130" cy="4279900"/>
+                    </a:xfrm>
+                    <a:prstGeom prst="rect">
+                      <a:avLst/>
+                    </a:prstGeom>
+                  </pic:spPr>
+                </pic:pic>
+              </a:graphicData>
+            </a:graphic>
+          </wp:inline>
+        </w:drawing>
+      </w:r>
+    </w:p>
+    <w:p/>
+    <w:p/>
+    <w:p/>
+    <w:p/>
+    <w:p/>
+    <w:p/>
+    <w:p/>
+    <w:p/>
+    <w:p/>
+    <w:p/>
+    <w:p/>
+    <w:p/>
+    <w:p>
+      <w:r>
+        <w:lastRenderedPageBreak/>
+        <w:t xml:space="preserve">Probar </w:t>
+      </w:r>
+      <w:proofErr w:type="spellStart"/>
+      <w:r>
+        <w:t>Strock</w:t>
+      </w:r>
+      <w:proofErr w:type="spellEnd"/>
+      <w:r>
+        <w:t xml:space="preserve"> insuficiente</w:t>
+      </w:r>
+    </w:p>
+    <w:p>
+      <w:r>
+        <w:drawing>
+          <wp:inline distT="0" distB="0" distL="0" distR="0" wp14:anchorId="757B5C1B" wp14:editId="1A4F8CFA">
+            <wp:extent cx="5612130" cy="4278629"/>
+            <wp:effectExtent l="0" t="0" r="7620" b="8255"/>
+            <wp:docPr id="49" name="Imagen 49"/>
+            <wp:cNvGraphicFramePr>
+              <a:graphicFrameLocks xmlns:a="http://schemas.openxmlformats.org/drawingml/2006/main" noChangeAspect="1"/>
+            </wp:cNvGraphicFramePr>
+            <a:graphic xmlns:a="http://schemas.openxmlformats.org/drawingml/2006/main">
+              <a:graphicData uri="http://schemas.openxmlformats.org/drawingml/2006/picture">
+                <pic:pic xmlns:pic="http://schemas.openxmlformats.org/drawingml/2006/picture">
+                  <pic:nvPicPr>
+                    <pic:cNvPr id="1" name=""/>
+                    <pic:cNvPicPr/>
+                  </pic:nvPicPr>
+                  <pic:blipFill>
+                    <a:blip r:embed="rId59"/>
+                    <a:stretch>
+                      <a:fillRect/>
+                    </a:stretch>
+                  </pic:blipFill>
+                  <pic:spPr>
+                    <a:xfrm>
+                      <a:off x="0" y="0"/>
+                      <a:ext cx="5634005" cy="4295306"/>
+                    </a:xfrm>
+                    <a:prstGeom prst="rect">
+                      <a:avLst/>
+                    </a:prstGeom>
+                  </pic:spPr>
+                </pic:pic>
+              </a:graphicData>
+            </a:graphic>
+          </wp:inline>
+        </w:drawing>
+      </w:r>
+    </w:p>
+    <w:p/>
+    <w:p/>
+    <w:p/>
     <w:sectPr>
       <w:pgSz w:w="12240" w:h="15840"/>
       <w:pgMar w:top="1417" w:right="1701" w:bottom="1417" w:left="1701" w:header="708" w:footer="708" w:gutter="0"/>
@@ -6067,6 +7894,41 @@
       <w:lang w:val="es-GT"/>
     </w:rPr>
   </w:style>
+  <w:style w:type="paragraph" w:styleId="Ttulo">
+    <w:name w:val="Title"/>
+    <w:basedOn w:val="Normal"/>
+    <w:next w:val="Normal"/>
+    <w:link w:val="TtuloCar"/>
+    <w:uiPriority w:val="10"/>
+    <w:qFormat/>
+    <w:rsid w:val="00092E31"/>
+    <w:pPr>
+      <w:spacing w:after="0" w:line="240" w:lineRule="auto"/>
+      <w:contextualSpacing/>
+    </w:pPr>
+    <w:rPr>
+      <w:rFonts w:asciiTheme="majorHAnsi" w:eastAsiaTheme="majorEastAsia" w:hAnsiTheme="majorHAnsi" w:cstheme="majorBidi"/>
+      <w:spacing w:val="-10"/>
+      <w:kern w:val="28"/>
+      <w:sz w:val="56"/>
+      <w:szCs w:val="56"/>
+    </w:rPr>
+  </w:style>
+  <w:style w:type="character" w:customStyle="1" w:styleId="TtuloCar">
+    <w:name w:val="Título Car"/>
+    <w:basedOn w:val="Fuentedeprrafopredeter"/>
+    <w:link w:val="Ttulo"/>
+    <w:uiPriority w:val="10"/>
+    <w:rsid w:val="00092E31"/>
+    <w:rPr>
+      <w:rFonts w:asciiTheme="majorHAnsi" w:eastAsiaTheme="majorEastAsia" w:hAnsiTheme="majorHAnsi" w:cstheme="majorBidi"/>
+      <w:spacing w:val="-10"/>
+      <w:kern w:val="28"/>
+      <w:sz w:val="56"/>
+      <w:szCs w:val="56"/>
+      <w:lang w:val="es-GT"/>
+    </w:rPr>
+  </w:style>
 </w:styles>
 </file>
 
@@ -6363,4 +8225,16 @@
     </a:ext>
   </a:extLst>
 </a:theme>
+</file>
+
+<file path=customXml/item1.xml><?xml version="1.0" encoding="utf-8"?>
+<b:Sources xmlns:b="http://schemas.openxmlformats.org/officeDocument/2006/bibliography" xmlns="http://schemas.openxmlformats.org/officeDocument/2006/bibliography" SelectedStyle="\APASixthEditionOfficeOnline.xsl" StyleName="APA" Version="6"/>
+</file>
+
+<file path=customXml/itemProps1.xml><?xml version="1.0" encoding="utf-8"?>
+<ds:datastoreItem xmlns:ds="http://schemas.openxmlformats.org/officeDocument/2006/customXml" ds:itemID="{240CBAF3-D334-4814-A8CD-FC5F516B747C}">
+  <ds:schemaRefs>
+    <ds:schemaRef ds:uri="http://schemas.openxmlformats.org/officeDocument/2006/bibliography"/>
+  </ds:schemaRefs>
+</ds:datastoreItem>
 </file>
</xml_diff>